<commit_message>
Take-Off M5: docs v1.4 — add 'The Take-Off Page' section, version history bump. Pass Take-Off Page complete.
Co-Authored-By: Claude Opus 4.7 (1M context) <noreply@anthropic.com>
</commit_message>
<xml_diff>
--- a/docs/output/surveillance_markup_user_guide.docx
+++ b/docs/output/surveillance_markup_user_guide.docx
@@ -68,7 +68,7 @@
           <w:sz w:val="24"/>
           <w:szCs w:val="24"/>
         </w:rPr>
-        <w:t xml:space="preserve">Version 1.3</w:t>
+        <w:t xml:space="preserve">Version 1.4</w:t>
       </w:r>
     </w:p>
     <w:p>
@@ -292,7 +292,7 @@
           <w:sz w:val="24"/>
           <w:szCs w:val="24"/>
         </w:rPr>
-        <w:t xml:space="preserve">10. Saving and Reloading Projects</w:t>
+        <w:t xml:space="preserve">10. The Take-Off Page</w:t>
       </w:r>
     </w:p>
     <w:p>
@@ -308,7 +308,7 @@
           <w:sz w:val="24"/>
           <w:szCs w:val="24"/>
         </w:rPr>
-        <w:t xml:space="preserve">11. Tips, Shortcuts, and Troubleshooting</w:t>
+        <w:t xml:space="preserve">11. Saving and Reloading Projects</w:t>
       </w:r>
     </w:p>
     <w:p>
@@ -324,7 +324,23 @@
           <w:sz w:val="24"/>
           <w:szCs w:val="24"/>
         </w:rPr>
-        <w:t xml:space="preserve">12. Version History</w:t>
+        <w:t xml:space="preserve">12. Tips, Shortcuts, and Troubleshooting</w:t>
+      </w:r>
+    </w:p>
+    <w:p>
+      <w:pPr>
+        <w:spacing w:after="100"/>
+        <w:ind w:left="0"/>
+      </w:pPr>
+      <w:r>
+        <w:rPr>
+          <w:b/>
+          <w:bCs/>
+          <w:color w:val="1F3A5F"/>
+          <w:sz w:val="24"/>
+          <w:szCs w:val="24"/>
+        </w:rPr>
+        <w:t xml:space="preserve">13. Version History</w:t>
       </w:r>
     </w:p>
     <w:p>
@@ -3165,6 +3181,346 @@
           <w:sz w:val="36"/>
           <w:szCs w:val="36"/>
         </w:rPr>
+        <w:t xml:space="preserve">The Take-Off Page</w:t>
+      </w:r>
+    </w:p>
+    <w:p>
+      <w:pPr>
+        <w:spacing w:after="120" w:line="300"/>
+      </w:pPr>
+      <w:r>
+        <w:t xml:space="preserve">The take-off page is the estimator's working document — a tabular "schedule of quantities" that lists every device on the floor plans, plus cabling and labor summaries. It's distinct from the BOM (which is procurement-focused, equipment-only) and from the floor plan markups (which show device placement, not detail).</w:t>
+      </w:r>
+    </w:p>
+    <w:p>
+      <w:pPr>
+        <w:spacing w:after="120" w:line="300"/>
+      </w:pPr>
+      <w:r>
+        <w:t xml:space="preserve">The take-off automatically appears in the exported proposal PDF between the BOM and the Riser, when there's content to show. It can be toggled off in the Export modal under Proposal Sections.</w:t>
+      </w:r>
+    </w:p>
+    <w:p>
+      <w:pPr>
+        <w:pStyle w:val="Heading2"/>
+        <w:spacing w:before="280" w:after="140"/>
+      </w:pPr>
+      <w:r>
+        <w:rPr>
+          <w:b/>
+          <w:bCs/>
+          <w:color w:val="1F3A5F"/>
+          <w:sz w:val="28"/>
+          <w:szCs w:val="28"/>
+        </w:rPr>
+        <w:t xml:space="preserve">What the take-off shows</w:t>
+      </w:r>
+    </w:p>
+    <w:p>
+      <w:pPr>
+        <w:spacing w:after="120" w:line="300"/>
+      </w:pPr>
+      <w:r>
+        <w:t xml:space="preserve">The take-off is organized into seven subsections:</w:t>
+      </w:r>
+    </w:p>
+    <w:p>
+      <w:pPr>
+        <w:pStyle w:val="ListParagraph"/>
+        <w:numPr>
+          <w:ilvl w:val="0"/>
+          <w:numId w:val="2"/>
+        </w:numPr>
+        <w:spacing w:after="80" w:line="300"/>
+      </w:pPr>
+      <w:r>
+        <w:rPr>
+          <w:b/>
+          <w:bCs/>
+        </w:rPr>
+        <w:t xml:space="preserve">Cameras</w:t>
+      </w:r>
+      <w:r>
+        <w:t xml:space="preserve"> — one row per placed camera with model, brand, mount height, FOV, reach</w:t>
+      </w:r>
+    </w:p>
+    <w:p>
+      <w:pPr>
+        <w:pStyle w:val="ListParagraph"/>
+        <w:numPr>
+          <w:ilvl w:val="0"/>
+          <w:numId w:val="2"/>
+        </w:numPr>
+        <w:spacing w:after="80" w:line="300"/>
+      </w:pPr>
+      <w:r>
+        <w:rPr>
+          <w:b/>
+          <w:bCs/>
+        </w:rPr>
+        <w:t xml:space="preserve">Access Control</w:t>
+      </w:r>
+      <w:r>
+        <w:t xml:space="preserve"> — one row per placed reader / controller with subcategory and variant</w:t>
+      </w:r>
+    </w:p>
+    <w:p>
+      <w:pPr>
+        <w:pStyle w:val="ListParagraph"/>
+        <w:numPr>
+          <w:ilvl w:val="0"/>
+          <w:numId w:val="2"/>
+        </w:numPr>
+        <w:spacing w:after="80" w:line="300"/>
+      </w:pPr>
+      <w:r>
+        <w:rPr>
+          <w:b/>
+          <w:bCs/>
+        </w:rPr>
+        <w:t xml:space="preserve">Smart Apartment: Placed Devices</w:t>
+      </w:r>
+      <w:r>
+        <w:t xml:space="preserve"> — intercoms, parcel lockers, mailbox banks</w:t>
+      </w:r>
+    </w:p>
+    <w:p>
+      <w:pPr>
+        <w:pStyle w:val="ListParagraph"/>
+        <w:numPr>
+          <w:ilvl w:val="0"/>
+          <w:numId w:val="2"/>
+        </w:numPr>
+        <w:spacing w:after="80" w:line="300"/>
+      </w:pPr>
+      <w:r>
+        <w:rPr>
+          <w:b/>
+          <w:bCs/>
+        </w:rPr>
+        <w:t xml:space="preserve">Smart Apartment: In-Unit (IoT)</w:t>
+      </w:r>
+      <w:r>
+        <w:t xml:space="preserve"> — Smart Lock / Thermostat / Water Sensor with per-suite count and total</w:t>
+      </w:r>
+    </w:p>
+    <w:p>
+      <w:pPr>
+        <w:pStyle w:val="ListParagraph"/>
+        <w:numPr>
+          <w:ilvl w:val="0"/>
+          <w:numId w:val="2"/>
+        </w:numPr>
+        <w:spacing w:after="80" w:line="300"/>
+      </w:pPr>
+      <w:r>
+        <w:rPr>
+          <w:b/>
+          <w:bCs/>
+        </w:rPr>
+        <w:t xml:space="preserve">Suites</w:t>
+      </w:r>
+      <w:r>
+        <w:t xml:space="preserve"> — one row per dwelling unit with type and BR/BA</w:t>
+      </w:r>
+    </w:p>
+    <w:p>
+      <w:pPr>
+        <w:pStyle w:val="ListParagraph"/>
+        <w:numPr>
+          <w:ilvl w:val="0"/>
+          <w:numId w:val="2"/>
+        </w:numPr>
+        <w:spacing w:after="80" w:line="300"/>
+      </w:pPr>
+      <w:r>
+        <w:rPr>
+          <w:b/>
+          <w:bCs/>
+        </w:rPr>
+        <w:t xml:space="preserve">Head-End Equipment</w:t>
+      </w:r>
+      <w:r>
+        <w:t xml:space="preserve"> — NVR, switches, UPS rolled up by model</w:t>
+      </w:r>
+    </w:p>
+    <w:p>
+      <w:pPr>
+        <w:pStyle w:val="ListParagraph"/>
+        <w:numPr>
+          <w:ilvl w:val="0"/>
+          <w:numId w:val="2"/>
+        </w:numPr>
+        <w:spacing w:after="80" w:line="300"/>
+      </w:pPr>
+      <w:r>
+        <w:rPr>
+          <w:b/>
+          <w:bCs/>
+        </w:rPr>
+        <w:t xml:space="preserve">Cabling Summary</w:t>
+      </w:r>
+      <w:r>
+        <w:t xml:space="preserve"> — total runs, total length, average run, and the routing overhead multiplier in use</w:t>
+      </w:r>
+    </w:p>
+    <w:p>
+      <w:pPr>
+        <w:pStyle w:val="ListParagraph"/>
+        <w:numPr>
+          <w:ilvl w:val="0"/>
+          <w:numId w:val="2"/>
+        </w:numPr>
+        <w:spacing w:after="80" w:line="300"/>
+      </w:pPr>
+      <w:r>
+        <w:rPr>
+          <w:b/>
+          <w:bCs/>
+        </w:rPr>
+        <w:t xml:space="preserve">Labor Summary</w:t>
+      </w:r>
+      <w:r>
+        <w:t xml:space="preserve"> — install hours by category (camera, reader, intercom, etc.) plus head-end bench-up, cabling, and commissioning</w:t>
+      </w:r>
+    </w:p>
+    <w:p>
+      <w:pPr>
+        <w:spacing w:after="120" w:line="300"/>
+      </w:pPr>
+      <w:r>
+        <w:t xml:space="preserve">All quantities reflect typical-floor multipliers — a camera on a page configured as "3 typical floors" contributes 3× to the cabling and labor totals (the placed-device rows still show one marker per placement, since rows are markers, not units).</w:t>
+      </w:r>
+    </w:p>
+    <w:p>
+      <w:pPr>
+        <w:pStyle w:val="Heading2"/>
+        <w:spacing w:before="280" w:after="140"/>
+      </w:pPr>
+      <w:r>
+        <w:rPr>
+          <w:b/>
+          <w:bCs/>
+          <w:color w:val="1F3A5F"/>
+          <w:sz w:val="28"/>
+          <w:szCs w:val="28"/>
+        </w:rPr>
+        <w:t xml:space="preserve">What the take-off does NOT show</w:t>
+      </w:r>
+    </w:p>
+    <w:p>
+      <w:pPr>
+        <w:pStyle w:val="ListParagraph"/>
+        <w:numPr>
+          <w:ilvl w:val="0"/>
+          <w:numId w:val="2"/>
+        </w:numPr>
+        <w:spacing w:after="80" w:line="300"/>
+      </w:pPr>
+      <w:r>
+        <w:t xml:space="preserve">Prices or costs (those come from the Quote, when pricing is loaded — a future release)</w:t>
+      </w:r>
+    </w:p>
+    <w:p>
+      <w:pPr>
+        <w:pStyle w:val="ListParagraph"/>
+        <w:numPr>
+          <w:ilvl w:val="0"/>
+          <w:numId w:val="2"/>
+        </w:numPr>
+        <w:spacing w:after="80" w:line="300"/>
+      </w:pPr>
+      <w:r>
+        <w:t xml:space="preserve">Profit margin, tax, or grand total</w:t>
+      </w:r>
+    </w:p>
+    <w:p>
+      <w:pPr>
+        <w:pStyle w:val="ListParagraph"/>
+        <w:numPr>
+          <w:ilvl w:val="0"/>
+          <w:numId w:val="2"/>
+        </w:numPr>
+        <w:spacing w:after="80" w:line="300"/>
+      </w:pPr>
+      <w:r>
+        <w:t xml:space="preserve">Customer-facing prose</w:t>
+      </w:r>
+    </w:p>
+    <w:p>
+      <w:pPr>
+        <w:spacing w:after="120" w:line="300"/>
+      </w:pPr>
+      <w:r>
+        <w:t xml:space="preserve">The take-off is for the estimator's bidding workflow. The BOM is for procurement once the job is awarded.</w:t>
+      </w:r>
+    </w:p>
+    <w:p>
+      <w:pPr>
+        <w:pStyle w:val="Heading2"/>
+        <w:spacing w:before="280" w:after="140"/>
+      </w:pPr>
+      <w:r>
+        <w:rPr>
+          <w:b/>
+          <w:bCs/>
+          <w:color w:val="1F3A5F"/>
+          <w:sz w:val="28"/>
+          <w:szCs w:val="28"/>
+        </w:rPr>
+        <w:t xml:space="preserve">Section 3b: IoT Per-Suite Quantities</w:t>
+      </w:r>
+    </w:p>
+    <w:p>
+      <w:pPr>
+        <w:spacing w:after="120" w:line="300"/>
+      </w:pPr>
+      <w:r>
+        <w:t xml:space="preserve">The IoT subsection shows the per-suite count for each selected IoT device. When all unit types specify the same count for a device, the column reads the integer (e.g., "1"). When unit types differ — for example, Penthouses get 2 smart locks but 1BRs get 1 — the column shows the weighted average (e.g., "1.2 (avg)") so the estimator can see at a glance that the count varies. The "Total Qty" column always shows the true total across all suites.</w:t>
+      </w:r>
+    </w:p>
+    <w:p>
+      <w:pPr>
+        <w:pStyle w:val="Heading2"/>
+        <w:spacing w:before="280" w:after="140"/>
+      </w:pPr>
+      <w:r>
+        <w:rPr>
+          <w:b/>
+          <w:bCs/>
+          <w:color w:val="1F3A5F"/>
+          <w:sz w:val="28"/>
+          <w:szCs w:val="28"/>
+        </w:rPr>
+        <w:t xml:space="preserve">Toggling the page off</w:t>
+      </w:r>
+    </w:p>
+    <w:p>
+      <w:pPr>
+        <w:spacing w:after="120" w:line="300"/>
+      </w:pPr>
+      <w:r>
+        <w:t xml:space="preserve">In the export modal under Proposal Sections, uncheck "Take-Off Page" to skip it. The PDF goes directly from BOM to Riser. Useful when you only need a quick BOM-only export for procurement review.</w:t>
+      </w:r>
+    </w:p>
+    <w:p>
+      <w:r>
+        <w:br w:type="page"/>
+      </w:r>
+    </w:p>
+    <w:p>
+      <w:pPr>
+        <w:pStyle w:val="Heading1"/>
+        <w:spacing w:before="360" w:after="200"/>
+      </w:pPr>
+      <w:r>
+        <w:rPr>
+          <w:b/>
+          <w:bCs/>
+          <w:color w:val="1F3A5F"/>
+          <w:sz w:val="36"/>
+          <w:szCs w:val="36"/>
+        </w:rPr>
         <w:t xml:space="preserve">Saving and Reloading Projects</w:t>
       </w:r>
     </w:p>
@@ -3939,6 +4295,108 @@
       </w:pPr>
       <w:r>
         <w:t xml:space="preserve">This guide is updated with each major release of the tool.</w:t>
+      </w:r>
+    </w:p>
+    <w:p>
+      <w:pPr>
+        <w:pStyle w:val="Heading2"/>
+        <w:spacing w:before="280" w:after="140"/>
+      </w:pPr>
+      <w:r>
+        <w:rPr>
+          <w:b/>
+          <w:bCs/>
+          <w:color w:val="1F3A5F"/>
+          <w:sz w:val="28"/>
+          <w:szCs w:val="28"/>
+        </w:rPr>
+        <w:t xml:space="preserve">Version 1.4 — May 2026</w:t>
+      </w:r>
+    </w:p>
+    <w:p>
+      <w:pPr>
+        <w:spacing w:after="120" w:line="300"/>
+      </w:pPr>
+      <w:r>
+        <w:t xml:space="preserve">Take-Off Page pass. New tabular schedule-of-quantities page in the proposal PDF between BOM and Riser. Equipment per-device detail, cabling totals, labor hours by category. Toggleable from the export modal.</w:t>
+      </w:r>
+    </w:p>
+    <w:p>
+      <w:pPr>
+        <w:pStyle w:val="ListParagraph"/>
+        <w:numPr>
+          <w:ilvl w:val="0"/>
+          <w:numId w:val="2"/>
+        </w:numPr>
+        <w:spacing w:after="80" w:line="300"/>
+      </w:pPr>
+      <w:r>
+        <w:t xml:space="preserve">New Take-Off Page rendered in the proposal PDF between BOM and Riser</w:t>
+      </w:r>
+    </w:p>
+    <w:p>
+      <w:pPr>
+        <w:pStyle w:val="ListParagraph"/>
+        <w:numPr>
+          <w:ilvl w:val="0"/>
+          <w:numId w:val="2"/>
+        </w:numPr>
+        <w:spacing w:after="80" w:line="300"/>
+      </w:pPr>
+      <w:r>
+        <w:t xml:space="preserve">Seven subsections: cameras, AC, smart apartment placed, smart apartment IoT, suites, head-end equipment, cabling summary, labor summary</w:t>
+      </w:r>
+    </w:p>
+    <w:p>
+      <w:pPr>
+        <w:pStyle w:val="ListParagraph"/>
+        <w:numPr>
+          <w:ilvl w:val="0"/>
+          <w:numId w:val="2"/>
+        </w:numPr>
+        <w:spacing w:after="80" w:line="300"/>
+      </w:pPr>
+      <w:r>
+        <w:t xml:space="preserve">Section 3b shows IoT per-suite counts; weighted-average suffix "(avg)" appears when unit types specify different counts</w:t>
+      </w:r>
+    </w:p>
+    <w:p>
+      <w:pPr>
+        <w:pStyle w:val="ListParagraph"/>
+        <w:numPr>
+          <w:ilvl w:val="0"/>
+          <w:numId w:val="2"/>
+        </w:numPr>
+        <w:spacing w:after="80" w:line="300"/>
+      </w:pPr>
+      <w:r>
+        <w:t xml:space="preserve">Page is toggleable from the Export modal (Proposal Sections → Take-Off Page)</w:t>
+      </w:r>
+    </w:p>
+    <w:p>
+      <w:pPr>
+        <w:pStyle w:val="ListParagraph"/>
+        <w:numPr>
+          <w:ilvl w:val="0"/>
+          <w:numId w:val="2"/>
+        </w:numPr>
+        <w:spacing w:after="80" w:line="300"/>
+      </w:pPr>
+      <w:r>
+        <w:t xml:space="preserve">Auto-paginates with continuation headers + footers for large projects</w:t>
+      </w:r>
+    </w:p>
+    <w:p>
+      <w:pPr>
+        <w:pStyle w:val="ListParagraph"/>
+        <w:numPr>
+          <w:ilvl w:val="0"/>
+          <w:numId w:val="2"/>
+        </w:numPr>
+        <w:spacing w:after="80" w:line="300"/>
+      </w:pPr>
+      <w:r>
+        <w:t xml:space="preserve">LABOR_RATES table in the codebase is consumed by the Take-Off; future Pricing pass adds dollar values</w:t>
       </w:r>
     </w:p>
     <w:p>

</xml_diff>

<commit_message>
Riser Layout M3: docs v1.5 — auto-spread within zone bands, multi-row wrap for dense zones. Pass Riser Layout complete.
Co-Authored-By: Claude Opus 4.7 (1M context) <noreply@anthropic.com>
</commit_message>
<xml_diff>
--- a/docs/output/surveillance_markup_user_guide.docx
+++ b/docs/output/surveillance_markup_user_guide.docx
@@ -68,7 +68,7 @@
           <w:sz w:val="24"/>
           <w:szCs w:val="24"/>
         </w:rPr>
-        <w:t xml:space="preserve">Version 1.4</w:t>
+        <w:t xml:space="preserve">Version 1.5</w:t>
       </w:r>
     </w:p>
     <w:p>
@@ -3156,6 +3156,14 @@
         <w:spacing w:after="120" w:line="300"/>
       </w:pPr>
       <w:r>
+        <w:t xml:space="preserve">Devices in each zone band are sorted left-to-right by their floor-plan position and distributed evenly across the rail. In high-density zones (15+ devices per rail), the layout wraps to a second row to keep icons readable.</w:t>
+      </w:r>
+    </w:p>
+    <w:p>
+      <w:pPr>
+        <w:spacing w:after="120" w:line="300"/>
+      </w:pPr>
+      <w:r>
         <w:rPr>
           <w:i/>
           <w:iCs/>
@@ -4295,6 +4303,95 @@
       </w:pPr>
       <w:r>
         <w:t xml:space="preserve">This guide is updated with each major release of the tool.</w:t>
+      </w:r>
+    </w:p>
+    <w:p>
+      <w:pPr>
+        <w:pStyle w:val="Heading2"/>
+        <w:spacing w:before="280" w:after="140"/>
+      </w:pPr>
+      <w:r>
+        <w:rPr>
+          <w:b/>
+          <w:bCs/>
+          <w:color w:val="1F3A5F"/>
+          <w:sz w:val="28"/>
+          <w:szCs w:val="28"/>
+        </w:rPr>
+        <w:t xml:space="preserve">Version 1.5 — May 2026</w:t>
+      </w:r>
+    </w:p>
+    <w:p>
+      <w:pPr>
+        <w:spacing w:after="120" w:line="300"/>
+      </w:pPr>
+      <w:r>
+        <w:t xml:space="preserve">Riser Layout pass. Devices on the riser now auto-spread evenly within each zone band, with multi-row wrap for high-density zones (15+ devices per rail).</w:t>
+      </w:r>
+    </w:p>
+    <w:p>
+      <w:pPr>
+        <w:pStyle w:val="ListParagraph"/>
+        <w:numPr>
+          <w:ilvl w:val="0"/>
+          <w:numId w:val="2"/>
+        </w:numPr>
+        <w:spacing w:after="80" w:line="300"/>
+      </w:pPr>
+      <w:r>
+        <w:t xml:space="preserve">Devices in each rail are sorted left-to-right by floor-plan position</w:t>
+      </w:r>
+    </w:p>
+    <w:p>
+      <w:pPr>
+        <w:pStyle w:val="ListParagraph"/>
+        <w:numPr>
+          <w:ilvl w:val="0"/>
+          <w:numId w:val="2"/>
+        </w:numPr>
+        <w:spacing w:after="80" w:line="300"/>
+      </w:pPr>
+      <w:r>
+        <w:t xml:space="preserve">Rails wrap to multiple rows when device count exceeds 15</w:t>
+      </w:r>
+    </w:p>
+    <w:p>
+      <w:pPr>
+        <w:pStyle w:val="ListParagraph"/>
+        <w:numPr>
+          <w:ilvl w:val="0"/>
+          <w:numId w:val="2"/>
+        </w:numPr>
+        <w:spacing w:after="80" w:line="300"/>
+      </w:pPr>
+      <w:r>
+        <w:t xml:space="preserve">Camera rail and AC rail wrap independently</w:t>
+      </w:r>
+    </w:p>
+    <w:p>
+      <w:pPr>
+        <w:pStyle w:val="ListParagraph"/>
+        <w:numPr>
+          <w:ilvl w:val="0"/>
+          <w:numId w:val="2"/>
+        </w:numPr>
+        <w:spacing w:after="80" w:line="300"/>
+      </w:pPr>
+      <w:r>
+        <w:t xml:space="preserve">AC category ordering preserved across rows (readers → controllers → intercoms → parcels → mailboxes)</w:t>
+      </w:r>
+    </w:p>
+    <w:p>
+      <w:pPr>
+        <w:pStyle w:val="ListParagraph"/>
+        <w:numPr>
+          <w:ilvl w:val="0"/>
+          <w:numId w:val="2"/>
+        </w:numPr>
+        <w:spacing w:after="80" w:line="300"/>
+      </w:pPr>
+      <w:r>
+        <w:t xml:space="preserve">Cable lines re-route automatically with new device positions</w:t>
       </w:r>
     </w:p>
     <w:p>

</xml_diff>

<commit_message>
Cleanup M6: user guide v1.6 — left-pane header relabels, Camera Accessories section, Equipment Labels visibility group, fisheye FOV, icon parity. Pass Cleanup complete.
</commit_message>
<xml_diff>
--- a/docs/output/surveillance_markup_user_guide.docx
+++ b/docs/output/surveillance_markup_user_guide.docx
@@ -68,7 +68,7 @@
           <w:sz w:val="24"/>
           <w:szCs w:val="24"/>
         </w:rPr>
-        <w:t xml:space="preserve">Version 1.5</w:t>
+        <w:t xml:space="preserve">Version 1.6</w:t>
       </w:r>
     </w:p>
     <w:p>
@@ -1380,7 +1380,7 @@
         <w:t xml:space="preserve">Pick a device</w:t>
       </w:r>
       <w:r>
-        <w:t xml:space="preserve"> from the drill-down panel on the left (brand → style → model, or whatever the mode's catalog offers).</w:t>
+        <w:t xml:space="preserve"> from the catalog panel on the left. Each section is labelled by tier — for cameras that's Camera Manufacturers, Camera Styles, and Camera Models; other modes follow the same pattern (e.g., AC Manufacturers / AC Devices / AC Models).</w:t>
       </w:r>
     </w:p>
     <w:p>
@@ -1549,7 +1549,37 @@
         <w:spacing w:after="120" w:line="300"/>
       </w:pPr>
       <w:r>
-        <w:t xml:space="preserve">The left pane shows a drill-down: brand → style → model. Drill down until a specific model is selected. Once selected, your next canvas click places that camera.</w:t>
+        <w:t xml:space="preserve">The left pane has three labelled sections that walk you from brand to specific model: </w:t>
+      </w:r>
+      <w:r>
+        <w:rPr>
+          <w:b/>
+          <w:bCs/>
+        </w:rPr>
+        <w:t xml:space="preserve">Camera Manufacturers</w:t>
+      </w:r>
+      <w:r>
+        <w:t xml:space="preserve">, </w:t>
+      </w:r>
+      <w:r>
+        <w:rPr>
+          <w:b/>
+          <w:bCs/>
+        </w:rPr>
+        <w:t xml:space="preserve">Camera Styles</w:t>
+      </w:r>
+      <w:r>
+        <w:t xml:space="preserve">, and </w:t>
+      </w:r>
+      <w:r>
+        <w:rPr>
+          <w:b/>
+          <w:bCs/>
+        </w:rPr>
+        <w:t xml:space="preserve">Camera Models</w:t>
+      </w:r>
+      <w:r>
+        <w:t xml:space="preserve">. Pick a manufacturer, then a style, then a specific model. Once selected, your next canvas click places that camera.</w:t>
       </w:r>
     </w:p>
     <w:p>
@@ -1564,7 +1594,7 @@
         <w:t xml:space="preserve">Six camera styles are supported:</w:t>
       </w:r>
       <w:r>
-        <w:t xml:space="preserve"> Dome, Bullet, Turret, Fisheye, PTZ, and LPR (license-plate-recognition). Each has its own flat icon style so you can tell them apart at a glance on the floor plan.</w:t>
+        <w:t xml:space="preserve"> Dome, Bullet, Turret, Fisheye, PTZ, and LPR (license-plate-recognition). The Camera Styles tile icons match the markers drawn on the floor plan, so you can tell at a glance which marker corresponds to which style. Fisheye cameras render a 180° coverage wedge on the floor plan.</w:t>
       </w:r>
     </w:p>
     <w:p>
@@ -1684,6 +1714,40 @@
           <w:sz w:val="28"/>
           <w:szCs w:val="28"/>
         </w:rPr>
+        <w:t xml:space="preserve">Head-end placement</w:t>
+      </w:r>
+    </w:p>
+    <w:p>
+      <w:pPr>
+        <w:spacing w:after="120" w:line="300"/>
+      </w:pPr>
+      <w:r>
+        <w:t xml:space="preserve">The </w:t>
+      </w:r>
+      <w:r>
+        <w:rPr>
+          <w:b/>
+          <w:bCs/>
+        </w:rPr>
+        <w:t xml:space="preserve">Camera Accessories</w:t>
+      </w:r>
+      <w:r>
+        <w:t xml:space="preserve"> section at the bottom of the Cameras left pane houses the CMVR/NVR tile. Click it and then click on the floor plan to place the head-end location for the current page (typically the NVR/IT room). This is the same action as Tools → Place Head-End.</w:t>
+      </w:r>
+    </w:p>
+    <w:p>
+      <w:pPr>
+        <w:pStyle w:val="Heading2"/>
+        <w:spacing w:before="280" w:after="140"/>
+      </w:pPr>
+      <w:r>
+        <w:rPr>
+          <w:b/>
+          <w:bCs/>
+          <w:color w:val="1F3A5F"/>
+          <w:sz w:val="28"/>
+          <w:szCs w:val="28"/>
+        </w:rPr>
         <w:t xml:space="preserve">Cable runs</w:t>
       </w:r>
     </w:p>
@@ -1692,7 +1756,7 @@
         <w:spacing w:after="120" w:line="300"/>
       </w:pPr>
       <w:r>
-        <w:t xml:space="preserve">Once a head-end location is set on the page (typically the NVR/IT room), the tool measures each camera's cable run distance from the camera to the head-end and applies a routing-overhead multiplier. The result feeds the riser diagram and the Take-Off page; cabling is not on the BOM (the BOM is equipment-only as of v1.3).</w:t>
+        <w:t xml:space="preserve">Once a head-end location is set on the page, the tool measures each camera's cable run distance from the camera to the head-end and applies a routing-overhead multiplier. The result feeds the riser diagram and the Take-Off page; cabling is not on the BOM (the BOM is equipment-only as of v1.3).</w:t>
       </w:r>
     </w:p>
     <w:p>
@@ -2289,35 +2353,35 @@
           <w:sz w:val="28"/>
           <w:szCs w:val="28"/>
         </w:rPr>
-        <w:t xml:space="preserve">Hide unit labels</w:t>
-      </w:r>
-    </w:p>
-    <w:p>
-      <w:pPr>
-        <w:spacing w:after="120" w:line="300"/>
-      </w:pPr>
-      <w:r>
-        <w:t xml:space="preserve">Need a clean view of the floor plan without label clutter? Click </w:t>
-      </w:r>
-      <w:r>
-        <w:rPr>
-          <w:b/>
-          <w:bCs/>
-        </w:rPr>
-        <w:t xml:space="preserve">Hide unit labels</w:t>
-      </w:r>
-      <w:r>
-        <w:t xml:space="preserve"> in the Suites left pane. Every suite collapses to a small green dot. Click any dot to reselect that suite. Click </w:t>
-      </w:r>
-      <w:r>
-        <w:rPr>
-          <w:b/>
-          <w:bCs/>
-        </w:rPr>
-        <w:t xml:space="preserve">Show unit labels</w:t>
-      </w:r>
-      <w:r>
-        <w:t xml:space="preserve"> to flip back.</w:t>
+        <w:t xml:space="preserve">Hide suite labels</w:t>
+      </w:r>
+    </w:p>
+    <w:p>
+      <w:pPr>
+        <w:spacing w:after="120" w:line="300"/>
+      </w:pPr>
+      <w:r>
+        <w:t xml:space="preserve">For a cleaner view of the floor plan, hide suite text labels via </w:t>
+      </w:r>
+      <w:r>
+        <w:rPr>
+          <w:b/>
+          <w:bCs/>
+        </w:rPr>
+        <w:t xml:space="preserve">View → Equipment Labels → Suite Labels</w:t>
+      </w:r>
+      <w:r>
+        <w:t xml:space="preserve">. Suite pill markers stay visible (as small empty pills) so you can still click to select them. The Equipment Labels group also lets you hide labels on the other five device families. See </w:t>
+      </w:r>
+      <w:r>
+        <w:rPr>
+          <w:i/>
+          <w:iCs/>
+        </w:rPr>
+        <w:t xml:space="preserve">Equipment Labels visibility</w:t>
+      </w:r>
+      <w:r>
+        <w:t xml:space="preserve"> in the Tips section.</w:t>
       </w:r>
     </w:p>
     <w:p>
@@ -4013,107 +4077,41 @@
           <w:sz w:val="28"/>
           <w:szCs w:val="28"/>
         </w:rPr>
-        <w:t xml:space="preserve">Working tips</w:t>
-      </w:r>
-    </w:p>
-    <w:p>
-      <w:pPr>
-        <w:pStyle w:val="ListParagraph"/>
-        <w:numPr>
-          <w:ilvl w:val="0"/>
-          <w:numId w:val="2"/>
-        </w:numPr>
-        <w:spacing w:after="80" w:line="300"/>
-      </w:pPr>
-      <w:r>
-        <w:rPr>
-          <w:b/>
-          <w:bCs/>
-        </w:rPr>
-        <w:t xml:space="preserve">Calibrate every page that has devices.</w:t>
-      </w:r>
-      <w:r>
-        <w:t xml:space="preserve"> Uncalibrated pages show cable lengths as "—" on the BOM and riser.</w:t>
-      </w:r>
-    </w:p>
-    <w:p>
-      <w:pPr>
-        <w:pStyle w:val="ListParagraph"/>
-        <w:numPr>
-          <w:ilvl w:val="0"/>
-          <w:numId w:val="2"/>
-        </w:numPr>
-        <w:spacing w:after="80" w:line="300"/>
-      </w:pPr>
-      <w:r>
-        <w:rPr>
-          <w:b/>
-          <w:bCs/>
-        </w:rPr>
-        <w:t xml:space="preserve">Use consistent zone names.</w:t>
-      </w:r>
-      <w:r>
-        <w:t xml:space="preserve"> When defining zones for the riser, type the same name for related cameras ("Floor 1", not a mix of "Floor 1" and "1st Floor"). The autocomplete will help you converge.</w:t>
-      </w:r>
-    </w:p>
-    <w:p>
-      <w:pPr>
-        <w:pStyle w:val="ListParagraph"/>
-        <w:numPr>
-          <w:ilvl w:val="0"/>
-          <w:numId w:val="2"/>
-        </w:numPr>
-        <w:spacing w:after="80" w:line="300"/>
-      </w:pPr>
-      <w:r>
-        <w:rPr>
-          <w:b/>
-          <w:bCs/>
-        </w:rPr>
-        <w:t xml:space="preserve">Click empty space to deselect.</w:t>
-      </w:r>
-      <w:r>
-        <w:t xml:space="preserve"> Easy way to close the right panel without dismissing modals.</w:t>
-      </w:r>
-    </w:p>
-    <w:p>
-      <w:pPr>
-        <w:pStyle w:val="ListParagraph"/>
-        <w:numPr>
-          <w:ilvl w:val="0"/>
-          <w:numId w:val="2"/>
-        </w:numPr>
-        <w:spacing w:after="80" w:line="300"/>
-      </w:pPr>
-      <w:r>
-        <w:rPr>
-          <w:b/>
-          <w:bCs/>
-        </w:rPr>
-        <w:t xml:space="preserve">Save often, even with auto-save on.</w:t>
-      </w:r>
-      <w:r>
-        <w:t xml:space="preserve"> Auto-save is in browser local storage — clearing your browser data will lose it. A manual save downloads a portable JSON file.</w:t>
-      </w:r>
-    </w:p>
-    <w:p>
-      <w:pPr>
-        <w:pStyle w:val="ListParagraph"/>
-        <w:numPr>
-          <w:ilvl w:val="0"/>
-          <w:numId w:val="2"/>
-        </w:numPr>
-        <w:spacing w:after="80" w:line="300"/>
-      </w:pPr>
-      <w:r>
-        <w:rPr>
-          <w:b/>
-          <w:bCs/>
-        </w:rPr>
-        <w:t xml:space="preserve">Bedroom/bathroom labels auto-fill.</w:t>
-      </w:r>
-      <w:r>
-        <w:t xml:space="preserve"> In the Unit Types modal, leave the Label blank and set BR/BA — the label fills in as "2BR / 1.5BA" automatically. Override the label any time and your text sticks.</w:t>
+        <w:t xml:space="preserve">Equipment Labels visibility</w:t>
+      </w:r>
+    </w:p>
+    <w:p>
+      <w:pPr>
+        <w:spacing w:after="120" w:line="300"/>
+      </w:pPr>
+      <w:r>
+        <w:t xml:space="preserve">The View menu's </w:t>
+      </w:r>
+      <w:r>
+        <w:rPr>
+          <w:b/>
+          <w:bCs/>
+        </w:rPr>
+        <w:t xml:space="preserve">Equipment Labels</w:t>
+      </w:r>
+      <w:r>
+        <w:t xml:space="preserve"> group controls the text labels shown next to each device on the floor plan. The master toggle hides or shows all device labels at once; the six children (Camera, Access Control, Intercom, Parcel, Mailbox, and Suite Labels) toggle each family independently.</w:t>
+      </w:r>
+    </w:p>
+    <w:p>
+      <w:pPr>
+        <w:spacing w:after="120" w:line="300"/>
+      </w:pPr>
+      <w:r>
+        <w:t xml:space="preserve">Hiding labels affects only the text — device markers and camera FOV cones remain visible. The master toggle shows a checkmark when all six children are on, a dash when some are on and some off (indeterminate), and is unchecked when all six are off.</w:t>
+      </w:r>
+    </w:p>
+    <w:p>
+      <w:pPr>
+        <w:spacing w:after="120" w:line="300"/>
+      </w:pPr>
+      <w:r>
+        <w:t xml:space="preserve">Label-visibility preferences are saved with the project, so a clean-view configuration carries over between sessions.</w:t>
       </w:r>
     </w:p>
     <w:p>
@@ -4129,6 +4127,122 @@
           <w:sz w:val="28"/>
           <w:szCs w:val="28"/>
         </w:rPr>
+        <w:t xml:space="preserve">Working tips</w:t>
+      </w:r>
+    </w:p>
+    <w:p>
+      <w:pPr>
+        <w:pStyle w:val="ListParagraph"/>
+        <w:numPr>
+          <w:ilvl w:val="0"/>
+          <w:numId w:val="2"/>
+        </w:numPr>
+        <w:spacing w:after="80" w:line="300"/>
+      </w:pPr>
+      <w:r>
+        <w:rPr>
+          <w:b/>
+          <w:bCs/>
+        </w:rPr>
+        <w:t xml:space="preserve">Calibrate every page that has devices.</w:t>
+      </w:r>
+      <w:r>
+        <w:t xml:space="preserve"> Uncalibrated pages show cable lengths as "—" on the BOM and riser.</w:t>
+      </w:r>
+    </w:p>
+    <w:p>
+      <w:pPr>
+        <w:pStyle w:val="ListParagraph"/>
+        <w:numPr>
+          <w:ilvl w:val="0"/>
+          <w:numId w:val="2"/>
+        </w:numPr>
+        <w:spacing w:after="80" w:line="300"/>
+      </w:pPr>
+      <w:r>
+        <w:rPr>
+          <w:b/>
+          <w:bCs/>
+        </w:rPr>
+        <w:t xml:space="preserve">Use consistent zone names.</w:t>
+      </w:r>
+      <w:r>
+        <w:t xml:space="preserve"> When defining zones for the riser, type the same name for related cameras ("Floor 1", not a mix of "Floor 1" and "1st Floor"). The autocomplete will help you converge.</w:t>
+      </w:r>
+    </w:p>
+    <w:p>
+      <w:pPr>
+        <w:pStyle w:val="ListParagraph"/>
+        <w:numPr>
+          <w:ilvl w:val="0"/>
+          <w:numId w:val="2"/>
+        </w:numPr>
+        <w:spacing w:after="80" w:line="300"/>
+      </w:pPr>
+      <w:r>
+        <w:rPr>
+          <w:b/>
+          <w:bCs/>
+        </w:rPr>
+        <w:t xml:space="preserve">Click empty space to deselect.</w:t>
+      </w:r>
+      <w:r>
+        <w:t xml:space="preserve"> Easy way to close the right panel without dismissing modals.</w:t>
+      </w:r>
+    </w:p>
+    <w:p>
+      <w:pPr>
+        <w:pStyle w:val="ListParagraph"/>
+        <w:numPr>
+          <w:ilvl w:val="0"/>
+          <w:numId w:val="2"/>
+        </w:numPr>
+        <w:spacing w:after="80" w:line="300"/>
+      </w:pPr>
+      <w:r>
+        <w:rPr>
+          <w:b/>
+          <w:bCs/>
+        </w:rPr>
+        <w:t xml:space="preserve">Save often, even with auto-save on.</w:t>
+      </w:r>
+      <w:r>
+        <w:t xml:space="preserve"> Auto-save is in browser local storage — clearing your browser data will lose it. A manual save downloads a portable JSON file.</w:t>
+      </w:r>
+    </w:p>
+    <w:p>
+      <w:pPr>
+        <w:pStyle w:val="ListParagraph"/>
+        <w:numPr>
+          <w:ilvl w:val="0"/>
+          <w:numId w:val="2"/>
+        </w:numPr>
+        <w:spacing w:after="80" w:line="300"/>
+      </w:pPr>
+      <w:r>
+        <w:rPr>
+          <w:b/>
+          <w:bCs/>
+        </w:rPr>
+        <w:t xml:space="preserve">Bedroom/bathroom labels auto-fill.</w:t>
+      </w:r>
+      <w:r>
+        <w:t xml:space="preserve"> In the Unit Types modal, leave the Label blank and set BR/BA — the label fills in as "2BR / 1.5BA" automatically. Override the label any time and your text sticks.</w:t>
+      </w:r>
+    </w:p>
+    <w:p>
+      <w:pPr>
+        <w:pStyle w:val="Heading2"/>
+        <w:spacing w:before="280" w:after="140"/>
+      </w:pPr>
+      <w:r>
+        <w:rPr>
+          <w:b/>
+          <w:bCs/>
+          <w:color w:val="1F3A5F"/>
+          <w:sz w:val="28"/>
+          <w:szCs w:val="28"/>
+        </w:rPr>
         <w:t xml:space="preserve">Common questions</w:t>
       </w:r>
     </w:p>
@@ -4318,80 +4432,93 @@
           <w:sz w:val="28"/>
           <w:szCs w:val="28"/>
         </w:rPr>
-        <w:t xml:space="preserve">Version 1.5 — May 2026</w:t>
-      </w:r>
-    </w:p>
-    <w:p>
-      <w:pPr>
-        <w:spacing w:after="120" w:line="300"/>
-      </w:pPr>
-      <w:r>
-        <w:t xml:space="preserve">Riser Layout pass. Devices on the riser now auto-spread evenly within each zone band, with multi-row wrap for high-density zones (15+ devices per rail).</w:t>
-      </w:r>
-    </w:p>
-    <w:p>
-      <w:pPr>
-        <w:pStyle w:val="ListParagraph"/>
-        <w:numPr>
-          <w:ilvl w:val="0"/>
-          <w:numId w:val="2"/>
-        </w:numPr>
-        <w:spacing w:after="80" w:line="300"/>
-      </w:pPr>
-      <w:r>
-        <w:t xml:space="preserve">Devices in each rail are sorted left-to-right by floor-plan position</w:t>
-      </w:r>
-    </w:p>
-    <w:p>
-      <w:pPr>
-        <w:pStyle w:val="ListParagraph"/>
-        <w:numPr>
-          <w:ilvl w:val="0"/>
-          <w:numId w:val="2"/>
-        </w:numPr>
-        <w:spacing w:after="80" w:line="300"/>
-      </w:pPr>
-      <w:r>
-        <w:t xml:space="preserve">Rails wrap to multiple rows when device count exceeds 15</w:t>
-      </w:r>
-    </w:p>
-    <w:p>
-      <w:pPr>
-        <w:pStyle w:val="ListParagraph"/>
-        <w:numPr>
-          <w:ilvl w:val="0"/>
-          <w:numId w:val="2"/>
-        </w:numPr>
-        <w:spacing w:after="80" w:line="300"/>
-      </w:pPr>
-      <w:r>
-        <w:t xml:space="preserve">Camera rail and AC rail wrap independently</w:t>
-      </w:r>
-    </w:p>
-    <w:p>
-      <w:pPr>
-        <w:pStyle w:val="ListParagraph"/>
-        <w:numPr>
-          <w:ilvl w:val="0"/>
-          <w:numId w:val="2"/>
-        </w:numPr>
-        <w:spacing w:after="80" w:line="300"/>
-      </w:pPr>
-      <w:r>
-        <w:t xml:space="preserve">AC category ordering preserved across rows (readers → controllers → intercoms → parcels → mailboxes)</w:t>
-      </w:r>
-    </w:p>
-    <w:p>
-      <w:pPr>
-        <w:pStyle w:val="ListParagraph"/>
-        <w:numPr>
-          <w:ilvl w:val="0"/>
-          <w:numId w:val="2"/>
-        </w:numPr>
-        <w:spacing w:after="80" w:line="300"/>
-      </w:pPr>
-      <w:r>
-        <w:t xml:space="preserve">Cable lines re-route automatically with new device positions</w:t>
+        <w:t xml:space="preserve">Version 1.6 — May 2026</w:t>
+      </w:r>
+    </w:p>
+    <w:p>
+      <w:pPr>
+        <w:spacing w:after="120" w:line="300"/>
+      </w:pPr>
+      <w:r>
+        <w:t xml:space="preserve">Cleanup pass. UI clarity and consistency improvements across the device-picker panes, plus a new Equipment Labels visibility control.</w:t>
+      </w:r>
+    </w:p>
+    <w:p>
+      <w:pPr>
+        <w:pStyle w:val="ListParagraph"/>
+        <w:numPr>
+          <w:ilvl w:val="0"/>
+          <w:numId w:val="2"/>
+        </w:numPr>
+        <w:spacing w:after="80" w:line="300"/>
+      </w:pPr>
+      <w:r>
+        <w:t xml:space="preserve">Left-pane section headers now use clear static labels (Camera Manufacturers / Camera Styles / Camera Models, and the parallel for each mode)</w:t>
+      </w:r>
+    </w:p>
+    <w:p>
+      <w:pPr>
+        <w:pStyle w:val="ListParagraph"/>
+        <w:numPr>
+          <w:ilvl w:val="0"/>
+          <w:numId w:val="2"/>
+        </w:numPr>
+        <w:spacing w:after="80" w:line="300"/>
+      </w:pPr>
+      <w:r>
+        <w:t xml:space="preserve">Camera Styles tile icons now match the markers drawn on the floor plan</w:t>
+      </w:r>
+    </w:p>
+    <w:p>
+      <w:pPr>
+        <w:pStyle w:val="ListParagraph"/>
+        <w:numPr>
+          <w:ilvl w:val="0"/>
+          <w:numId w:val="2"/>
+        </w:numPr>
+        <w:spacing w:after="80" w:line="300"/>
+      </w:pPr>
+      <w:r>
+        <w:t xml:space="preserve">Fisheye cameras now render their FOV coverage wedge</w:t>
+      </w:r>
+    </w:p>
+    <w:p>
+      <w:pPr>
+        <w:pStyle w:val="ListParagraph"/>
+        <w:numPr>
+          <w:ilvl w:val="0"/>
+          <w:numId w:val="2"/>
+        </w:numPr>
+        <w:spacing w:after="80" w:line="300"/>
+      </w:pPr>
+      <w:r>
+        <w:t xml:space="preserve">New Camera Accessories section in the Cameras pane (houses the CMVR/NVR head-end placement)</w:t>
+      </w:r>
+    </w:p>
+    <w:p>
+      <w:pPr>
+        <w:pStyle w:val="ListParagraph"/>
+        <w:numPr>
+          <w:ilvl w:val="0"/>
+          <w:numId w:val="2"/>
+        </w:numPr>
+        <w:spacing w:after="80" w:line="300"/>
+      </w:pPr>
+      <w:r>
+        <w:t xml:space="preserve">New Equipment Labels visibility group in the View menu — master toggle plus per-family controls for hiding/showing device text labels; preferences saved with the project</w:t>
+      </w:r>
+    </w:p>
+    <w:p>
+      <w:pPr>
+        <w:pStyle w:val="ListParagraph"/>
+        <w:numPr>
+          <w:ilvl w:val="0"/>
+          <w:numId w:val="2"/>
+        </w:numPr>
+        <w:spacing w:after="80" w:line="300"/>
+      </w:pPr>
+      <w:r>
+        <w:t xml:space="preserve">Removed the standalone Suites-mode "Hide unit labels" control (suite-label visibility now lives only under Equipment Labels → Suite Labels)</w:t>
       </w:r>
     </w:p>
     <w:p>
@@ -4407,93 +4534,80 @@
           <w:sz w:val="28"/>
           <w:szCs w:val="28"/>
         </w:rPr>
-        <w:t xml:space="preserve">Version 1.4 — May 2026</w:t>
-      </w:r>
-    </w:p>
-    <w:p>
-      <w:pPr>
-        <w:spacing w:after="120" w:line="300"/>
-      </w:pPr>
-      <w:r>
-        <w:t xml:space="preserve">Take-Off Page pass. New tabular schedule-of-quantities page in the proposal PDF between BOM and Riser. Equipment per-device detail, cabling totals, labor hours by category. Toggleable from the export modal.</w:t>
-      </w:r>
-    </w:p>
-    <w:p>
-      <w:pPr>
-        <w:pStyle w:val="ListParagraph"/>
-        <w:numPr>
-          <w:ilvl w:val="0"/>
-          <w:numId w:val="2"/>
-        </w:numPr>
-        <w:spacing w:after="80" w:line="300"/>
-      </w:pPr>
-      <w:r>
-        <w:t xml:space="preserve">New Take-Off Page rendered in the proposal PDF between BOM and Riser</w:t>
-      </w:r>
-    </w:p>
-    <w:p>
-      <w:pPr>
-        <w:pStyle w:val="ListParagraph"/>
-        <w:numPr>
-          <w:ilvl w:val="0"/>
-          <w:numId w:val="2"/>
-        </w:numPr>
-        <w:spacing w:after="80" w:line="300"/>
-      </w:pPr>
-      <w:r>
-        <w:t xml:space="preserve">Seven subsections: cameras, AC, smart apartment placed, smart apartment IoT, suites, head-end equipment, cabling summary, labor summary</w:t>
-      </w:r>
-    </w:p>
-    <w:p>
-      <w:pPr>
-        <w:pStyle w:val="ListParagraph"/>
-        <w:numPr>
-          <w:ilvl w:val="0"/>
-          <w:numId w:val="2"/>
-        </w:numPr>
-        <w:spacing w:after="80" w:line="300"/>
-      </w:pPr>
-      <w:r>
-        <w:t xml:space="preserve">Section 3b shows IoT per-suite counts; weighted-average suffix "(avg)" appears when unit types specify different counts</w:t>
-      </w:r>
-    </w:p>
-    <w:p>
-      <w:pPr>
-        <w:pStyle w:val="ListParagraph"/>
-        <w:numPr>
-          <w:ilvl w:val="0"/>
-          <w:numId w:val="2"/>
-        </w:numPr>
-        <w:spacing w:after="80" w:line="300"/>
-      </w:pPr>
-      <w:r>
-        <w:t xml:space="preserve">Page is toggleable from the Export modal (Proposal Sections → Take-Off Page)</w:t>
-      </w:r>
-    </w:p>
-    <w:p>
-      <w:pPr>
-        <w:pStyle w:val="ListParagraph"/>
-        <w:numPr>
-          <w:ilvl w:val="0"/>
-          <w:numId w:val="2"/>
-        </w:numPr>
-        <w:spacing w:after="80" w:line="300"/>
-      </w:pPr>
-      <w:r>
-        <w:t xml:space="preserve">Auto-paginates with continuation headers + footers for large projects</w:t>
-      </w:r>
-    </w:p>
-    <w:p>
-      <w:pPr>
-        <w:pStyle w:val="ListParagraph"/>
-        <w:numPr>
-          <w:ilvl w:val="0"/>
-          <w:numId w:val="2"/>
-        </w:numPr>
-        <w:spacing w:after="80" w:line="300"/>
-      </w:pPr>
-      <w:r>
-        <w:t xml:space="preserve">LABOR_RATES table in the codebase is consumed by the Take-Off; future Pricing pass adds dollar values</w:t>
+        <w:t xml:space="preserve">Version 1.5 — May 2026</w:t>
+      </w:r>
+    </w:p>
+    <w:p>
+      <w:pPr>
+        <w:spacing w:after="120" w:line="300"/>
+      </w:pPr>
+      <w:r>
+        <w:t xml:space="preserve">Riser Layout pass. Devices on the riser now auto-spread evenly within each zone band, with multi-row wrap for high-density zones (15+ devices per rail).</w:t>
+      </w:r>
+    </w:p>
+    <w:p>
+      <w:pPr>
+        <w:pStyle w:val="ListParagraph"/>
+        <w:numPr>
+          <w:ilvl w:val="0"/>
+          <w:numId w:val="2"/>
+        </w:numPr>
+        <w:spacing w:after="80" w:line="300"/>
+      </w:pPr>
+      <w:r>
+        <w:t xml:space="preserve">Devices in each rail are sorted left-to-right by floor-plan position</w:t>
+      </w:r>
+    </w:p>
+    <w:p>
+      <w:pPr>
+        <w:pStyle w:val="ListParagraph"/>
+        <w:numPr>
+          <w:ilvl w:val="0"/>
+          <w:numId w:val="2"/>
+        </w:numPr>
+        <w:spacing w:after="80" w:line="300"/>
+      </w:pPr>
+      <w:r>
+        <w:t xml:space="preserve">Rails wrap to multiple rows when device count exceeds 15</w:t>
+      </w:r>
+    </w:p>
+    <w:p>
+      <w:pPr>
+        <w:pStyle w:val="ListParagraph"/>
+        <w:numPr>
+          <w:ilvl w:val="0"/>
+          <w:numId w:val="2"/>
+        </w:numPr>
+        <w:spacing w:after="80" w:line="300"/>
+      </w:pPr>
+      <w:r>
+        <w:t xml:space="preserve">Camera rail and AC rail wrap independently</w:t>
+      </w:r>
+    </w:p>
+    <w:p>
+      <w:pPr>
+        <w:pStyle w:val="ListParagraph"/>
+        <w:numPr>
+          <w:ilvl w:val="0"/>
+          <w:numId w:val="2"/>
+        </w:numPr>
+        <w:spacing w:after="80" w:line="300"/>
+      </w:pPr>
+      <w:r>
+        <w:t xml:space="preserve">AC category ordering preserved across rows (readers → controllers → intercoms → parcels → mailboxes)</w:t>
+      </w:r>
+    </w:p>
+    <w:p>
+      <w:pPr>
+        <w:pStyle w:val="ListParagraph"/>
+        <w:numPr>
+          <w:ilvl w:val="0"/>
+          <w:numId w:val="2"/>
+        </w:numPr>
+        <w:spacing w:after="80" w:line="300"/>
+      </w:pPr>
+      <w:r>
+        <w:t xml:space="preserve">Cable lines re-route automatically with new device positions</w:t>
       </w:r>
     </w:p>
     <w:p>
@@ -4509,80 +4623,93 @@
           <w:sz w:val="28"/>
           <w:szCs w:val="28"/>
         </w:rPr>
-        <w:t xml:space="preserve">Version 1.3 — May 2026</w:t>
-      </w:r>
-    </w:p>
-    <w:p>
-      <w:pPr>
-        <w:spacing w:after="120" w:line="300"/>
-      </w:pPr>
-      <w:r>
-        <w:t xml:space="preserve">BOM Restructure pass. BOM is now an equipment-only procurement list.</w:t>
-      </w:r>
-    </w:p>
-    <w:p>
-      <w:pPr>
-        <w:pStyle w:val="ListParagraph"/>
-        <w:numPr>
-          <w:ilvl w:val="0"/>
-          <w:numId w:val="2"/>
-        </w:numPr>
-        <w:spacing w:after="80" w:line="300"/>
-      </w:pPr>
-      <w:r>
-        <w:t xml:space="preserve">Cabling and Labor sections removed from the BOM</w:t>
-      </w:r>
-    </w:p>
-    <w:p>
-      <w:pPr>
-        <w:pStyle w:val="ListParagraph"/>
-        <w:numPr>
-          <w:ilvl w:val="0"/>
-          <w:numId w:val="2"/>
-        </w:numPr>
-        <w:spacing w:after="80" w:line="300"/>
-      </w:pPr>
-      <w:r>
-        <w:t xml:space="preserve">GRAND TOTAL on the cover page now reflects equipment-only totals</w:t>
-      </w:r>
-    </w:p>
-    <w:p>
-      <w:pPr>
-        <w:pStyle w:val="ListParagraph"/>
-        <w:numPr>
-          <w:ilvl w:val="0"/>
-          <w:numId w:val="2"/>
-        </w:numPr>
-        <w:spacing w:after="80" w:line="300"/>
-      </w:pPr>
-      <w:r>
-        <w:t xml:space="preserve">Cabling and labor data computed separately; will surface on the Take-Off page (next pass) and the Quote page (future pass) when pricing is loaded</w:t>
-      </w:r>
-    </w:p>
-    <w:p>
-      <w:pPr>
-        <w:pStyle w:val="ListParagraph"/>
-        <w:numPr>
-          <w:ilvl w:val="0"/>
-          <w:numId w:val="2"/>
-        </w:numPr>
-        <w:spacing w:after="80" w:line="300"/>
-      </w:pPr>
-      <w:r>
-        <w:t xml:space="preserve">BOM drawer labor-rate / labor-hours inputs removed (no longer had any compute effect after the restructure)</w:t>
-      </w:r>
-    </w:p>
-    <w:p>
-      <w:pPr>
-        <w:pStyle w:val="ListParagraph"/>
-        <w:numPr>
-          <w:ilvl w:val="0"/>
-          <w:numId w:val="2"/>
-        </w:numPr>
-        <w:spacing w:after="80" w:line="300"/>
-      </w:pPr>
-      <w:r>
-        <w:t xml:space="preserve">Custom lines previously in the Cabling or Labor sections of older saves are now preserved in the OTHER section with a "(was: Cabling)" or "(was: Labor)" prefix on load</w:t>
+        <w:t xml:space="preserve">Version 1.4 — May 2026</w:t>
+      </w:r>
+    </w:p>
+    <w:p>
+      <w:pPr>
+        <w:spacing w:after="120" w:line="300"/>
+      </w:pPr>
+      <w:r>
+        <w:t xml:space="preserve">Take-Off Page pass. New tabular schedule-of-quantities page in the proposal PDF between BOM and Riser. Equipment per-device detail, cabling totals, labor hours by category. Toggleable from the export modal.</w:t>
+      </w:r>
+    </w:p>
+    <w:p>
+      <w:pPr>
+        <w:pStyle w:val="ListParagraph"/>
+        <w:numPr>
+          <w:ilvl w:val="0"/>
+          <w:numId w:val="2"/>
+        </w:numPr>
+        <w:spacing w:after="80" w:line="300"/>
+      </w:pPr>
+      <w:r>
+        <w:t xml:space="preserve">New Take-Off Page rendered in the proposal PDF between BOM and Riser</w:t>
+      </w:r>
+    </w:p>
+    <w:p>
+      <w:pPr>
+        <w:pStyle w:val="ListParagraph"/>
+        <w:numPr>
+          <w:ilvl w:val="0"/>
+          <w:numId w:val="2"/>
+        </w:numPr>
+        <w:spacing w:after="80" w:line="300"/>
+      </w:pPr>
+      <w:r>
+        <w:t xml:space="preserve">Seven subsections: cameras, AC, smart apartment placed, smart apartment IoT, suites, head-end equipment, cabling summary, labor summary</w:t>
+      </w:r>
+    </w:p>
+    <w:p>
+      <w:pPr>
+        <w:pStyle w:val="ListParagraph"/>
+        <w:numPr>
+          <w:ilvl w:val="0"/>
+          <w:numId w:val="2"/>
+        </w:numPr>
+        <w:spacing w:after="80" w:line="300"/>
+      </w:pPr>
+      <w:r>
+        <w:t xml:space="preserve">Section 3b shows IoT per-suite counts; weighted-average suffix "(avg)" appears when unit types specify different counts</w:t>
+      </w:r>
+    </w:p>
+    <w:p>
+      <w:pPr>
+        <w:pStyle w:val="ListParagraph"/>
+        <w:numPr>
+          <w:ilvl w:val="0"/>
+          <w:numId w:val="2"/>
+        </w:numPr>
+        <w:spacing w:after="80" w:line="300"/>
+      </w:pPr>
+      <w:r>
+        <w:t xml:space="preserve">Page is toggleable from the Export modal (Proposal Sections → Take-Off Page)</w:t>
+      </w:r>
+    </w:p>
+    <w:p>
+      <w:pPr>
+        <w:pStyle w:val="ListParagraph"/>
+        <w:numPr>
+          <w:ilvl w:val="0"/>
+          <w:numId w:val="2"/>
+        </w:numPr>
+        <w:spacing w:after="80" w:line="300"/>
+      </w:pPr>
+      <w:r>
+        <w:t xml:space="preserve">Auto-paginates with continuation headers + footers for large projects</w:t>
+      </w:r>
+    </w:p>
+    <w:p>
+      <w:pPr>
+        <w:pStyle w:val="ListParagraph"/>
+        <w:numPr>
+          <w:ilvl w:val="0"/>
+          <w:numId w:val="2"/>
+        </w:numPr>
+        <w:spacing w:after="80" w:line="300"/>
+      </w:pPr>
+      <w:r>
+        <w:t xml:space="preserve">LABOR_RATES table in the codebase is consumed by the Take-Off; future Pricing pass adds dollar values</w:t>
       </w:r>
     </w:p>
     <w:p>
@@ -4598,93 +4725,80 @@
           <w:sz w:val="28"/>
           <w:szCs w:val="28"/>
         </w:rPr>
-        <w:t xml:space="preserve">Version 1.2 — May 2026</w:t>
-      </w:r>
-    </w:p>
-    <w:p>
-      <w:pPr>
-        <w:spacing w:after="120" w:line="300"/>
-      </w:pPr>
-      <w:r>
-        <w:t xml:space="preserve">Suites Polish pass. The IoT Devices modal now selects which devices are available for per-unit-type configuration. Unit types gain dynamic columns for setting per-suite IoT counts. BOM and Take-Off automatically apply these counts when computing totals across the building.</w:t>
-      </w:r>
-    </w:p>
-    <w:p>
-      <w:pPr>
-        <w:pStyle w:val="ListParagraph"/>
-        <w:numPr>
-          <w:ilvl w:val="0"/>
-          <w:numId w:val="2"/>
-        </w:numPr>
-        <w:spacing w:after="80" w:line="300"/>
-      </w:pPr>
-      <w:r>
-        <w:t xml:space="preserve">IoT Devices modal: 3 checkboxes now mean "available for per-unit-type configuration" rather than "every suite gets this"</w:t>
-      </w:r>
-    </w:p>
-    <w:p>
-      <w:pPr>
-        <w:pStyle w:val="ListParagraph"/>
-        <w:numPr>
-          <w:ilvl w:val="0"/>
-          <w:numId w:val="2"/>
-        </w:numPr>
-        <w:spacing w:after="80" w:line="300"/>
-      </w:pPr>
-      <w:r>
-        <w:t xml:space="preserve">Unit Types modal: dynamic columns appear per selected IoT device, letting integrators set per-suite counts per unit type</w:t>
-      </w:r>
-    </w:p>
-    <w:p>
-      <w:pPr>
-        <w:pStyle w:val="ListParagraph"/>
-        <w:numPr>
-          <w:ilvl w:val="0"/>
-          <w:numId w:val="2"/>
-        </w:numPr>
-        <w:spacing w:after="80" w:line="300"/>
-      </w:pPr>
-      <w:r>
-        <w:t xml:space="preserve">Duplicate unit-type labels now flagged with an inline error</w:t>
-      </w:r>
-    </w:p>
-    <w:p>
-      <w:pPr>
-        <w:pStyle w:val="ListParagraph"/>
-        <w:numPr>
-          <w:ilvl w:val="0"/>
-          <w:numId w:val="2"/>
-        </w:numPr>
-        <w:spacing w:after="80" w:line="300"/>
-      </w:pPr>
-      <w:r>
-        <w:t xml:space="preserve">Suites mode left pane: Unit Types and IoT Devices entry tiles redesigned to match the Tier-1 tile aesthetic used in other modes</w:t>
-      </w:r>
-    </w:p>
-    <w:p>
-      <w:pPr>
-        <w:pStyle w:val="ListParagraph"/>
-        <w:numPr>
-          <w:ilvl w:val="0"/>
-          <w:numId w:val="2"/>
-        </w:numPr>
-        <w:spacing w:after="80" w:line="300"/>
-      </w:pPr>
-      <w:r>
-        <w:t xml:space="preserve">Mode color identity: every top-rail mode tab and Tier-1 tile in all modes now uses a consistent mode-color palette (Cameras=red, Access=blue, Intercoms=green, Parcel=orange, Mailbox=pink, Suites=purple) for selected and hover states</w:t>
-      </w:r>
-    </w:p>
-    <w:p>
-      <w:pPr>
-        <w:pStyle w:val="ListParagraph"/>
-        <w:numPr>
-          <w:ilvl w:val="0"/>
-          <w:numId w:val="2"/>
-        </w:numPr>
-        <w:spacing w:after="80" w:line="300"/>
-      </w:pPr>
-      <w:r>
-        <w:t xml:space="preserve">Intercom tile color shifted from teal to green (canvas marker teal preserved); Suite mode color shifted from green to purple</w:t>
+        <w:t xml:space="preserve">Version 1.3 — May 2026</w:t>
+      </w:r>
+    </w:p>
+    <w:p>
+      <w:pPr>
+        <w:spacing w:after="120" w:line="300"/>
+      </w:pPr>
+      <w:r>
+        <w:t xml:space="preserve">BOM Restructure pass. BOM is now an equipment-only procurement list.</w:t>
+      </w:r>
+    </w:p>
+    <w:p>
+      <w:pPr>
+        <w:pStyle w:val="ListParagraph"/>
+        <w:numPr>
+          <w:ilvl w:val="0"/>
+          <w:numId w:val="2"/>
+        </w:numPr>
+        <w:spacing w:after="80" w:line="300"/>
+      </w:pPr>
+      <w:r>
+        <w:t xml:space="preserve">Cabling and Labor sections removed from the BOM</w:t>
+      </w:r>
+    </w:p>
+    <w:p>
+      <w:pPr>
+        <w:pStyle w:val="ListParagraph"/>
+        <w:numPr>
+          <w:ilvl w:val="0"/>
+          <w:numId w:val="2"/>
+        </w:numPr>
+        <w:spacing w:after="80" w:line="300"/>
+      </w:pPr>
+      <w:r>
+        <w:t xml:space="preserve">GRAND TOTAL on the cover page now reflects equipment-only totals</w:t>
+      </w:r>
+    </w:p>
+    <w:p>
+      <w:pPr>
+        <w:pStyle w:val="ListParagraph"/>
+        <w:numPr>
+          <w:ilvl w:val="0"/>
+          <w:numId w:val="2"/>
+        </w:numPr>
+        <w:spacing w:after="80" w:line="300"/>
+      </w:pPr>
+      <w:r>
+        <w:t xml:space="preserve">Cabling and labor data computed separately; will surface on the Take-Off page (next pass) and the Quote page (future pass) when pricing is loaded</w:t>
+      </w:r>
+    </w:p>
+    <w:p>
+      <w:pPr>
+        <w:pStyle w:val="ListParagraph"/>
+        <w:numPr>
+          <w:ilvl w:val="0"/>
+          <w:numId w:val="2"/>
+        </w:numPr>
+        <w:spacing w:after="80" w:line="300"/>
+      </w:pPr>
+      <w:r>
+        <w:t xml:space="preserve">BOM drawer labor-rate / labor-hours inputs removed (no longer had any compute effect after the restructure)</w:t>
+      </w:r>
+    </w:p>
+    <w:p>
+      <w:pPr>
+        <w:pStyle w:val="ListParagraph"/>
+        <w:numPr>
+          <w:ilvl w:val="0"/>
+          <w:numId w:val="2"/>
+        </w:numPr>
+        <w:spacing w:after="80" w:line="300"/>
+      </w:pPr>
+      <w:r>
+        <w:t xml:space="preserve">Custom lines previously in the Cabling or Labor sections of older saves are now preserved in the OTHER section with a "(was: Cabling)" or "(was: Labor)" prefix on load</w:t>
       </w:r>
     </w:p>
     <w:p>
@@ -4700,126 +4814,93 @@
           <w:sz w:val="28"/>
           <w:szCs w:val="28"/>
         </w:rPr>
-        <w:t xml:space="preserve">Version 1.1 — May 2026</w:t>
-      </w:r>
-    </w:p>
-    <w:p>
-      <w:pPr>
-        <w:spacing w:after="120" w:line="300"/>
-      </w:pPr>
-      <w:r>
-        <w:t xml:space="preserve">Pass N+1 complete. Adds smart-apartment device families and IoT integration on top of the v1.0 surface.</w:t>
-      </w:r>
-    </w:p>
-    <w:p>
-      <w:pPr>
-        <w:pStyle w:val="ListParagraph"/>
-        <w:numPr>
-          <w:ilvl w:val="0"/>
-          <w:numId w:val="2"/>
-        </w:numPr>
-        <w:spacing w:after="80" w:line="300"/>
-      </w:pPr>
-      <w:r>
-        <w:t xml:space="preserve">New </w:t>
-      </w:r>
-      <w:r>
-        <w:rPr>
-          <w:b/>
-          <w:bCs/>
-        </w:rPr>
-        <w:t xml:space="preserve">IoT Devices</w:t>
-      </w:r>
-      <w:r>
-        <w:t xml:space="preserve"> modal in Suites mode (Smart Lock, Thermostat, Water Sensor)</w:t>
-      </w:r>
-    </w:p>
-    <w:p>
-      <w:pPr>
-        <w:pStyle w:val="ListParagraph"/>
-        <w:numPr>
-          <w:ilvl w:val="0"/>
-          <w:numId w:val="2"/>
-        </w:numPr>
-        <w:spacing w:after="80" w:line="300"/>
-      </w:pPr>
-      <w:r>
-        <w:t xml:space="preserve">New </w:t>
-      </w:r>
-      <w:r>
-        <w:rPr>
-          <w:b/>
-          <w:bCs/>
-        </w:rPr>
-        <w:t xml:space="preserve">SMART APARTMENT</w:t>
-      </w:r>
-      <w:r>
-        <w:t xml:space="preserve"> BOM section grouping intercoms, parcel lockers, mailbox banks, and in-unit IoT</w:t>
-      </w:r>
-    </w:p>
-    <w:p>
-      <w:pPr>
-        <w:pStyle w:val="ListParagraph"/>
-        <w:numPr>
-          <w:ilvl w:val="0"/>
-          <w:numId w:val="2"/>
-        </w:numPr>
-        <w:spacing w:after="80" w:line="300"/>
-      </w:pPr>
-      <w:r>
-        <w:t xml:space="preserve">Cover summary now shows INTERCOMS / PARCEL LOCKERS / MAILBOX BANKS counts and per-unit-type suite counts</w:t>
-      </w:r>
-    </w:p>
-    <w:p>
-      <w:pPr>
-        <w:pStyle w:val="ListParagraph"/>
-        <w:numPr>
-          <w:ilvl w:val="0"/>
-          <w:numId w:val="2"/>
-        </w:numPr>
-        <w:spacing w:after="80" w:line="300"/>
-      </w:pPr>
-      <w:r>
-        <w:t xml:space="preserve">BOM drawer header mirrors the new counts as stat tiles</w:t>
-      </w:r>
-    </w:p>
-    <w:p>
-      <w:pPr>
-        <w:pStyle w:val="ListParagraph"/>
-        <w:numPr>
-          <w:ilvl w:val="0"/>
-          <w:numId w:val="2"/>
-        </w:numPr>
-        <w:spacing w:after="80" w:line="300"/>
-      </w:pPr>
-      <w:r>
-        <w:t xml:space="preserve">Riser diagram extended: smart-apartment devices appear on the head-end rail; per-floor equipment schedule includes grouped smart-apartment rows</w:t>
-      </w:r>
-    </w:p>
-    <w:p>
-      <w:pPr>
-        <w:pStyle w:val="ListParagraph"/>
-        <w:numPr>
-          <w:ilvl w:val="0"/>
-          <w:numId w:val="2"/>
-        </w:numPr>
-        <w:spacing w:after="80" w:line="300"/>
-      </w:pPr>
-      <w:r>
-        <w:t xml:space="preserve">All counts respect typical-floor multipliers</w:t>
-      </w:r>
-    </w:p>
-    <w:p>
-      <w:pPr>
-        <w:pStyle w:val="ListParagraph"/>
-        <w:numPr>
-          <w:ilvl w:val="0"/>
-          <w:numId w:val="2"/>
-        </w:numPr>
-        <w:spacing w:after="80" w:line="300"/>
-      </w:pPr>
-      <w:r>
-        <w:t xml:space="preserve">Intercom color shifted from teal-600 to teal-700 (`#0f766e`) to better distinguish from turret cameras at small riser scale</w:t>
+        <w:t xml:space="preserve">Version 1.2 — May 2026</w:t>
+      </w:r>
+    </w:p>
+    <w:p>
+      <w:pPr>
+        <w:spacing w:after="120" w:line="300"/>
+      </w:pPr>
+      <w:r>
+        <w:t xml:space="preserve">Suites Polish pass. The IoT Devices modal now selects which devices are available for per-unit-type configuration. Unit types gain dynamic columns for setting per-suite IoT counts. BOM and Take-Off automatically apply these counts when computing totals across the building.</w:t>
+      </w:r>
+    </w:p>
+    <w:p>
+      <w:pPr>
+        <w:pStyle w:val="ListParagraph"/>
+        <w:numPr>
+          <w:ilvl w:val="0"/>
+          <w:numId w:val="2"/>
+        </w:numPr>
+        <w:spacing w:after="80" w:line="300"/>
+      </w:pPr>
+      <w:r>
+        <w:t xml:space="preserve">IoT Devices modal: 3 checkboxes now mean "available for per-unit-type configuration" rather than "every suite gets this"</w:t>
+      </w:r>
+    </w:p>
+    <w:p>
+      <w:pPr>
+        <w:pStyle w:val="ListParagraph"/>
+        <w:numPr>
+          <w:ilvl w:val="0"/>
+          <w:numId w:val="2"/>
+        </w:numPr>
+        <w:spacing w:after="80" w:line="300"/>
+      </w:pPr>
+      <w:r>
+        <w:t xml:space="preserve">Unit Types modal: dynamic columns appear per selected IoT device, letting integrators set per-suite counts per unit type</w:t>
+      </w:r>
+    </w:p>
+    <w:p>
+      <w:pPr>
+        <w:pStyle w:val="ListParagraph"/>
+        <w:numPr>
+          <w:ilvl w:val="0"/>
+          <w:numId w:val="2"/>
+        </w:numPr>
+        <w:spacing w:after="80" w:line="300"/>
+      </w:pPr>
+      <w:r>
+        <w:t xml:space="preserve">Duplicate unit-type labels now flagged with an inline error</w:t>
+      </w:r>
+    </w:p>
+    <w:p>
+      <w:pPr>
+        <w:pStyle w:val="ListParagraph"/>
+        <w:numPr>
+          <w:ilvl w:val="0"/>
+          <w:numId w:val="2"/>
+        </w:numPr>
+        <w:spacing w:after="80" w:line="300"/>
+      </w:pPr>
+      <w:r>
+        <w:t xml:space="preserve">Suites mode left pane: Unit Types and IoT Devices entry tiles redesigned to match the Tier-1 tile aesthetic used in other modes</w:t>
+      </w:r>
+    </w:p>
+    <w:p>
+      <w:pPr>
+        <w:pStyle w:val="ListParagraph"/>
+        <w:numPr>
+          <w:ilvl w:val="0"/>
+          <w:numId w:val="2"/>
+        </w:numPr>
+        <w:spacing w:after="80" w:line="300"/>
+      </w:pPr>
+      <w:r>
+        <w:t xml:space="preserve">Mode color identity: every top-rail mode tab and Tier-1 tile in all modes now uses a consistent mode-color palette (Cameras=red, Access=blue, Intercoms=green, Parcel=orange, Mailbox=pink, Suites=purple) for selected and hover states</w:t>
+      </w:r>
+    </w:p>
+    <w:p>
+      <w:pPr>
+        <w:pStyle w:val="ListParagraph"/>
+        <w:numPr>
+          <w:ilvl w:val="0"/>
+          <w:numId w:val="2"/>
+        </w:numPr>
+        <w:spacing w:after="80" w:line="300"/>
+      </w:pPr>
+      <w:r>
+        <w:t xml:space="preserve">Intercom tile color shifted from teal to green (canvas marker teal preserved); Suite mode color shifted from green to purple</w:t>
       </w:r>
     </w:p>
     <w:p>
@@ -4835,6 +4916,141 @@
           <w:sz w:val="28"/>
           <w:szCs w:val="28"/>
         </w:rPr>
+        <w:t xml:space="preserve">Version 1.1 — May 2026</w:t>
+      </w:r>
+    </w:p>
+    <w:p>
+      <w:pPr>
+        <w:spacing w:after="120" w:line="300"/>
+      </w:pPr>
+      <w:r>
+        <w:t xml:space="preserve">Pass N+1 complete. Adds smart-apartment device families and IoT integration on top of the v1.0 surface.</w:t>
+      </w:r>
+    </w:p>
+    <w:p>
+      <w:pPr>
+        <w:pStyle w:val="ListParagraph"/>
+        <w:numPr>
+          <w:ilvl w:val="0"/>
+          <w:numId w:val="2"/>
+        </w:numPr>
+        <w:spacing w:after="80" w:line="300"/>
+      </w:pPr>
+      <w:r>
+        <w:t xml:space="preserve">New </w:t>
+      </w:r>
+      <w:r>
+        <w:rPr>
+          <w:b/>
+          <w:bCs/>
+        </w:rPr>
+        <w:t xml:space="preserve">IoT Devices</w:t>
+      </w:r>
+      <w:r>
+        <w:t xml:space="preserve"> modal in Suites mode (Smart Lock, Thermostat, Water Sensor)</w:t>
+      </w:r>
+    </w:p>
+    <w:p>
+      <w:pPr>
+        <w:pStyle w:val="ListParagraph"/>
+        <w:numPr>
+          <w:ilvl w:val="0"/>
+          <w:numId w:val="2"/>
+        </w:numPr>
+        <w:spacing w:after="80" w:line="300"/>
+      </w:pPr>
+      <w:r>
+        <w:t xml:space="preserve">New </w:t>
+      </w:r>
+      <w:r>
+        <w:rPr>
+          <w:b/>
+          <w:bCs/>
+        </w:rPr>
+        <w:t xml:space="preserve">SMART APARTMENT</w:t>
+      </w:r>
+      <w:r>
+        <w:t xml:space="preserve"> BOM section grouping intercoms, parcel lockers, mailbox banks, and in-unit IoT</w:t>
+      </w:r>
+    </w:p>
+    <w:p>
+      <w:pPr>
+        <w:pStyle w:val="ListParagraph"/>
+        <w:numPr>
+          <w:ilvl w:val="0"/>
+          <w:numId w:val="2"/>
+        </w:numPr>
+        <w:spacing w:after="80" w:line="300"/>
+      </w:pPr>
+      <w:r>
+        <w:t xml:space="preserve">Cover summary now shows INTERCOMS / PARCEL LOCKERS / MAILBOX BANKS counts and per-unit-type suite counts</w:t>
+      </w:r>
+    </w:p>
+    <w:p>
+      <w:pPr>
+        <w:pStyle w:val="ListParagraph"/>
+        <w:numPr>
+          <w:ilvl w:val="0"/>
+          <w:numId w:val="2"/>
+        </w:numPr>
+        <w:spacing w:after="80" w:line="300"/>
+      </w:pPr>
+      <w:r>
+        <w:t xml:space="preserve">BOM drawer header mirrors the new counts as stat tiles</w:t>
+      </w:r>
+    </w:p>
+    <w:p>
+      <w:pPr>
+        <w:pStyle w:val="ListParagraph"/>
+        <w:numPr>
+          <w:ilvl w:val="0"/>
+          <w:numId w:val="2"/>
+        </w:numPr>
+        <w:spacing w:after="80" w:line="300"/>
+      </w:pPr>
+      <w:r>
+        <w:t xml:space="preserve">Riser diagram extended: smart-apartment devices appear on the head-end rail; per-floor equipment schedule includes grouped smart-apartment rows</w:t>
+      </w:r>
+    </w:p>
+    <w:p>
+      <w:pPr>
+        <w:pStyle w:val="ListParagraph"/>
+        <w:numPr>
+          <w:ilvl w:val="0"/>
+          <w:numId w:val="2"/>
+        </w:numPr>
+        <w:spacing w:after="80" w:line="300"/>
+      </w:pPr>
+      <w:r>
+        <w:t xml:space="preserve">All counts respect typical-floor multipliers</w:t>
+      </w:r>
+    </w:p>
+    <w:p>
+      <w:pPr>
+        <w:pStyle w:val="ListParagraph"/>
+        <w:numPr>
+          <w:ilvl w:val="0"/>
+          <w:numId w:val="2"/>
+        </w:numPr>
+        <w:spacing w:after="80" w:line="300"/>
+      </w:pPr>
+      <w:r>
+        <w:t xml:space="preserve">Intercom color shifted from teal-600 to teal-700 (`#0f766e`) to better distinguish from turret cameras at small riser scale</w:t>
+      </w:r>
+    </w:p>
+    <w:p>
+      <w:pPr>
+        <w:pStyle w:val="Heading2"/>
+        <w:spacing w:before="280" w:after="140"/>
+      </w:pPr>
+      <w:r>
+        <w:rPr>
+          <w:b/>
+          <w:bCs/>
+          <w:color w:val="1F3A5F"/>
+          <w:sz w:val="28"/>
+          <w:szCs w:val="28"/>
+        </w:rPr>
         <w:t xml:space="preserve">Version 1.0 — May 2026</w:t>
       </w:r>
     </w:p>
@@ -4959,7 +5175,7 @@
           <w:i/>
           <w:iCs/>
         </w:rPr>
-        <w:t xml:space="preserve">This document supersedes any earlier user-facing documentation. Last updated: May 19, 2026.</w:t>
+        <w:t xml:space="preserve">This document supersedes any earlier user-facing documentation. Last updated: May 20, 2026.</w:t>
       </w:r>
     </w:p>
     <w:sectPr>

</xml_diff>

<commit_message>
Pricing Foundation M4: user guide v1.7 — Load/Clear Pricing flow, per-machine storage, quoting foundation (cost rendering noted as future). Pass Pricing Foundation complete.
</commit_message>
<xml_diff>
--- a/docs/output/surveillance_markup_user_guide.docx
+++ b/docs/output/surveillance_markup_user_guide.docx
@@ -68,7 +68,7 @@
           <w:sz w:val="24"/>
           <w:szCs w:val="24"/>
         </w:rPr>
-        <w:t xml:space="preserve">Version 1.6</w:t>
+        <w:t xml:space="preserve">Version 1.7</w:t>
       </w:r>
     </w:p>
     <w:p>
@@ -324,7 +324,7 @@
           <w:sz w:val="24"/>
           <w:szCs w:val="24"/>
         </w:rPr>
-        <w:t xml:space="preserve">12. Tips, Shortcuts, and Troubleshooting</w:t>
+        <w:t xml:space="preserve">12. Pricing Data</w:t>
       </w:r>
     </w:p>
     <w:p>
@@ -340,7 +340,23 @@
           <w:sz w:val="24"/>
           <w:szCs w:val="24"/>
         </w:rPr>
-        <w:t xml:space="preserve">13. Version History</w:t>
+        <w:t xml:space="preserve">13. Tips, Shortcuts, and Troubleshooting</w:t>
+      </w:r>
+    </w:p>
+    <w:p>
+      <w:pPr>
+        <w:spacing w:after="100"/>
+        <w:ind w:left="0"/>
+      </w:pPr>
+      <w:r>
+        <w:rPr>
+          <w:b/>
+          <w:bCs/>
+          <w:color w:val="1F3A5F"/>
+          <w:sz w:val="24"/>
+          <w:szCs w:val="24"/>
+        </w:rPr>
+        <w:t xml:space="preserve">14. Version History</w:t>
       </w:r>
     </w:p>
     <w:p>
@@ -3811,6 +3827,418 @@
           <w:sz w:val="36"/>
           <w:szCs w:val="36"/>
         </w:rPr>
+        <w:t xml:space="preserve">Pricing Data</w:t>
+      </w:r>
+    </w:p>
+    <w:p>
+      <w:pPr>
+        <w:spacing w:after="120" w:line="300"/>
+      </w:pPr>
+      <w:r>
+        <w:t xml:space="preserve">Vendor pricing is </w:t>
+      </w:r>
+      <w:r>
+        <w:rPr>
+          <w:b/>
+          <w:bCs/>
+        </w:rPr>
+        <w:t xml:space="preserve">external</w:t>
+      </w:r>
+      <w:r>
+        <w:t xml:space="preserve"> to the tool. There's no price book embedded in the HTML, and prices are never stored inside a project file. Instead, you maintain a `pricing.json` file on your machine and load it into the tool when you want quoting features.</w:t>
+      </w:r>
+    </w:p>
+    <w:p>
+      <w:pPr>
+        <w:spacing w:after="120" w:line="300"/>
+      </w:pPr>
+      <w:r>
+        <w:t xml:space="preserve">This keeps vendor pricing private (the integrator's contractual data stays out of project files and out of git history) and lets you update prices independently — a new vendor price book means re-editing the JSON, not a tool release.</w:t>
+      </w:r>
+    </w:p>
+    <w:p>
+      <w:pPr>
+        <w:pStyle w:val="Heading2"/>
+        <w:spacing w:before="280" w:after="140"/>
+      </w:pPr>
+      <w:r>
+        <w:rPr>
+          <w:b/>
+          <w:bCs/>
+          <w:color w:val="1F3A5F"/>
+          <w:sz w:val="28"/>
+          <w:szCs w:val="28"/>
+        </w:rPr>
+        <w:t xml:space="preserve">Loading pricing</w:t>
+      </w:r>
+    </w:p>
+    <w:p>
+      <w:pPr>
+        <w:spacing w:after="120" w:line="300"/>
+      </w:pPr>
+      <w:r>
+        <w:t xml:space="preserve">Use </w:t>
+      </w:r>
+      <w:r>
+        <w:rPr>
+          <w:b/>
+          <w:bCs/>
+        </w:rPr>
+        <w:t xml:space="preserve">File → Load Pricing…</w:t>
+      </w:r>
+      <w:r>
+        <w:t xml:space="preserve"> and pick your `pricing.json`. The tool validates the schema, then loads the data into the browser's local storage on this machine.</w:t>
+      </w:r>
+    </w:p>
+    <w:p>
+      <w:pPr>
+        <w:spacing w:after="120" w:line="300"/>
+      </w:pPr>
+      <w:r>
+        <w:t xml:space="preserve">After loading:</w:t>
+      </w:r>
+    </w:p>
+    <w:p>
+      <w:pPr>
+        <w:pStyle w:val="ListParagraph"/>
+        <w:numPr>
+          <w:ilvl w:val="0"/>
+          <w:numId w:val="2"/>
+        </w:numPr>
+        <w:spacing w:after="80" w:line="300"/>
+      </w:pPr>
+      <w:r>
+        <w:t xml:space="preserve">The menubar status indicator near the top right reads </w:t>
+      </w:r>
+      <w:r>
+        <w:rPr>
+          <w:b/>
+          <w:bCs/>
+        </w:rPr>
+        <w:t xml:space="preserve">Pricing · CAD · 2026-05-20</w:t>
+      </w:r>
+      <w:r>
+        <w:t xml:space="preserve"> (or whatever currency and date your file specifies), in subdued grey.</w:t>
+      </w:r>
+    </w:p>
+    <w:p>
+      <w:pPr>
+        <w:pStyle w:val="ListParagraph"/>
+        <w:numPr>
+          <w:ilvl w:val="0"/>
+          <w:numId w:val="2"/>
+        </w:numPr>
+        <w:spacing w:after="80" w:line="300"/>
+      </w:pPr>
+      <w:r>
+        <w:t xml:space="preserve">The reminder banner inside the BOM drawer disappears.</w:t>
+      </w:r>
+    </w:p>
+    <w:p>
+      <w:pPr>
+        <w:spacing w:after="120" w:line="300"/>
+      </w:pPr>
+      <w:r>
+        <w:t xml:space="preserve">When pricing is </w:t>
+      </w:r>
+      <w:r>
+        <w:rPr>
+          <w:b/>
+          <w:bCs/>
+        </w:rPr>
+        <w:t xml:space="preserve">not</w:t>
+      </w:r>
+      <w:r>
+        <w:t xml:space="preserve"> loaded:</w:t>
+      </w:r>
+    </w:p>
+    <w:p>
+      <w:pPr>
+        <w:pStyle w:val="ListParagraph"/>
+        <w:numPr>
+          <w:ilvl w:val="0"/>
+          <w:numId w:val="2"/>
+        </w:numPr>
+        <w:spacing w:after="80" w:line="300"/>
+      </w:pPr>
+      <w:r>
+        <w:t xml:space="preserve">The status indicator reads </w:t>
+      </w:r>
+      <w:r>
+        <w:rPr>
+          <w:b/>
+          <w:bCs/>
+        </w:rPr>
+        <w:t xml:space="preserve">Pricing · not loaded</w:t>
+      </w:r>
+      <w:r>
+        <w:t xml:space="preserve"> in amber.</w:t>
+      </w:r>
+    </w:p>
+    <w:p>
+      <w:pPr>
+        <w:pStyle w:val="ListParagraph"/>
+        <w:numPr>
+          <w:ilvl w:val="0"/>
+          <w:numId w:val="2"/>
+        </w:numPr>
+        <w:spacing w:after="80" w:line="300"/>
+      </w:pPr>
+      <w:r>
+        <w:t xml:space="preserve">A banner at the top of the BOM drawer reminds you that quote totals are disabled until a pricing file is loaded. The banner has a </w:t>
+      </w:r>
+      <w:r>
+        <w:rPr>
+          <w:b/>
+          <w:bCs/>
+        </w:rPr>
+        <w:t xml:space="preserve">Load Now</w:t>
+      </w:r>
+      <w:r>
+        <w:t xml:space="preserve"> button that opens the same file picker.</w:t>
+      </w:r>
+    </w:p>
+    <w:p>
+      <w:pPr>
+        <w:spacing w:after="120" w:line="300"/>
+      </w:pPr>
+      <w:r>
+        <w:t xml:space="preserve">You can also click the menubar status indicator directly to open the file picker — useful when you want to swap in a refreshed pricing file without going through the menu.</w:t>
+      </w:r>
+    </w:p>
+    <w:p>
+      <w:pPr>
+        <w:pStyle w:val="Heading2"/>
+        <w:spacing w:before="280" w:after="140"/>
+      </w:pPr>
+      <w:r>
+        <w:rPr>
+          <w:b/>
+          <w:bCs/>
+          <w:color w:val="1F3A5F"/>
+          <w:sz w:val="28"/>
+          <w:szCs w:val="28"/>
+        </w:rPr>
+        <w:t xml:space="preserve">Clearing pricing</w:t>
+      </w:r>
+    </w:p>
+    <w:p>
+      <w:pPr>
+        <w:spacing w:after="120" w:line="300"/>
+      </w:pPr>
+      <w:r>
+        <w:t xml:space="preserve">Use </w:t>
+      </w:r>
+      <w:r>
+        <w:rPr>
+          <w:b/>
+          <w:bCs/>
+        </w:rPr>
+        <w:t xml:space="preserve">File → Clear Pricing</w:t>
+      </w:r>
+      <w:r>
+        <w:t xml:space="preserve"> to remove the loaded data. A confirmation prompt notes that pricing is file-based — you can re-load anytime. After clearing, the banner reappears and the status indicator reverts to amber.</w:t>
+      </w:r>
+    </w:p>
+    <w:p>
+      <w:pPr>
+        <w:pStyle w:val="Heading2"/>
+        <w:spacing w:before="280" w:after="140"/>
+      </w:pPr>
+      <w:r>
+        <w:rPr>
+          <w:b/>
+          <w:bCs/>
+          <w:color w:val="1F3A5F"/>
+          <w:sz w:val="28"/>
+          <w:szCs w:val="28"/>
+        </w:rPr>
+        <w:t xml:space="preserve">Where pricing is stored</w:t>
+      </w:r>
+    </w:p>
+    <w:p>
+      <w:pPr>
+        <w:spacing w:after="120" w:line="300"/>
+      </w:pPr>
+      <w:r>
+        <w:t xml:space="preserve">Loaded pricing lives in your browser's </w:t>
+      </w:r>
+      <w:r>
+        <w:rPr>
+          <w:b/>
+          <w:bCs/>
+        </w:rPr>
+        <w:t xml:space="preserve">local storage</w:t>
+      </w:r>
+      <w:r>
+        <w:t xml:space="preserve">, separately from project files. It persists across sessions on the same machine and browser, but it's not bundled into any saved project JSON. When you open a project on a different machine (or a fresh browser profile), you'll need to load the pricing file there too — once. Clearing your browser's site data wipes the loaded pricing; re-load to restore it.</w:t>
+      </w:r>
+    </w:p>
+    <w:tbl>
+      <w:tblPr>
+        <w:tblW w:type="dxa" w:w="9360"/>
+        <w:tblBorders>
+          <w:top w:val="single" w:color="auto" w:sz="4"/>
+          <w:left w:val="single" w:color="auto" w:sz="4"/>
+          <w:bottom w:val="single" w:color="auto" w:sz="4"/>
+          <w:right w:val="single" w:color="auto" w:sz="4"/>
+          <w:insideH w:val="single" w:color="auto" w:sz="4"/>
+          <w:insideV w:val="single" w:color="auto" w:sz="4"/>
+        </w:tblBorders>
+      </w:tblPr>
+      <w:tblGrid>
+        <w:gridCol w:w="9360"/>
+      </w:tblGrid>
+      <w:tr>
+        <w:tc>
+          <w:tcPr>
+            <w:tcW w:type="dxa" w:w="9360"/>
+            <w:tcBorders>
+              <w:top w:val="single" w:color="2E75B6" w:sz="4"/>
+              <w:left w:val="single" w:color="2E75B6" w:sz="4"/>
+              <w:bottom w:val="single" w:color="2E75B6" w:sz="4"/>
+              <w:right w:val="single" w:color="2E75B6" w:sz="4"/>
+            </w:tcBorders>
+            <w:shd w:fill="EAF2FA" w:val="clear"/>
+            <w:tcMar>
+              <w:top w:type="dxa" w:w="200"/>
+              <w:left w:type="dxa" w:w="240"/>
+              <w:bottom w:type="dxa" w:w="200"/>
+              <w:right w:type="dxa" w:w="240"/>
+            </w:tcMar>
+          </w:tcPr>
+          <w:p>
+            <w:pPr>
+              <w:spacing w:after="100"/>
+            </w:pPr>
+            <w:r>
+              <w:rPr>
+                <w:b/>
+                <w:bCs/>
+                <w:color w:val="1F3A5F"/>
+              </w:rPr>
+              <w:t xml:space="preserve">Pricing and project files are separate</w:t>
+            </w:r>
+          </w:p>
+          <w:p>
+            <w:pPr>
+              <w:spacing w:after="80" w:line="280"/>
+            </w:pPr>
+            <w:r>
+              <w:t xml:space="preserve">A saved project JSON contains floor plans, device placements, BOM custom lines, and project info — but no prices. This is deliberate: project files can be shared between integrators without exposing vendor pricing.</w:t>
+            </w:r>
+          </w:p>
+        </w:tc>
+      </w:tr>
+    </w:tbl>
+    <w:p>
+      <w:pPr>
+        <w:spacing w:after="120"/>
+      </w:pPr>
+      <w:r>
+        <w:t xml:space="preserve"/>
+      </w:r>
+    </w:p>
+    <w:p>
+      <w:pPr>
+        <w:pStyle w:val="Heading2"/>
+        <w:spacing w:before="280" w:after="140"/>
+      </w:pPr>
+      <w:r>
+        <w:rPr>
+          <w:b/>
+          <w:bCs/>
+          <w:color w:val="1F3A5F"/>
+          <w:sz w:val="28"/>
+          <w:szCs w:val="28"/>
+        </w:rPr>
+        <w:t xml:space="preserve">What quoting features look like today</w:t>
+      </w:r>
+    </w:p>
+    <w:p>
+      <w:pPr>
+        <w:spacing w:after="120" w:line="300"/>
+      </w:pPr>
+      <w:r>
+        <w:t xml:space="preserve">This release ships the </w:t>
+      </w:r>
+      <w:r>
+        <w:rPr>
+          <w:b/>
+          <w:bCs/>
+        </w:rPr>
+        <w:t xml:space="preserve">loading foundation</w:t>
+      </w:r>
+      <w:r>
+        <w:t xml:space="preserve"> for pricing. Cost columns on the BOM, totals on the Take-Off page, and Grand Total figures on the proposal cover are coming in a later release — the data is in place, but the rendering surfaces will arrive together as a separate update.</w:t>
+      </w:r>
+    </w:p>
+    <w:p>
+      <w:pPr>
+        <w:spacing w:after="120" w:line="300"/>
+      </w:pPr>
+      <w:r>
+        <w:t xml:space="preserve">In other words: loading a pricing file today doesn't change the BOM drawer's appearance or the proposal PDF output yet. The status indicator just confirms the file is loaded and ready for the next release to consume.</w:t>
+      </w:r>
+    </w:p>
+    <w:p>
+      <w:pPr>
+        <w:pStyle w:val="Heading2"/>
+        <w:spacing w:before="280" w:after="140"/>
+      </w:pPr>
+      <w:r>
+        <w:rPr>
+          <w:b/>
+          <w:bCs/>
+          <w:color w:val="1F3A5F"/>
+          <w:sz w:val="28"/>
+          <w:szCs w:val="28"/>
+        </w:rPr>
+        <w:t xml:space="preserve">Maintaining the pricing file</w:t>
+      </w:r>
+    </w:p>
+    <w:p>
+      <w:pPr>
+        <w:spacing w:after="120" w:line="300"/>
+      </w:pPr>
+      <w:r>
+        <w:t xml:space="preserve">The `pricing.json` file is a small JSON document with a published schema (`schema_version`, `currency`, `updated`, `labor_rate_per_hour`, and an `items` map keyed by SKU). The integrator hand-curates it from vendor price books.</w:t>
+      </w:r>
+    </w:p>
+    <w:p>
+      <w:pPr>
+        <w:spacing w:after="120" w:line="300"/>
+      </w:pPr>
+      <w:r>
+        <w:t xml:space="preserve">A template is shipped in the repo at `source-data/pricing-template.json` — copy it to `source-data/pricing.json` and fill in real prices. The `source-data/README.md` in the same folder documents the curation flow and the schema in detail.</w:t>
+      </w:r>
+    </w:p>
+    <w:p>
+      <w:pPr>
+        <w:spacing w:after="120" w:line="300"/>
+      </w:pPr>
+      <w:r>
+        <w:t xml:space="preserve">The `source-data/` folder is gitignored except for the template and README, so neither vendor PDFs nor your curated `pricing.json` ever land in version control.</w:t>
+      </w:r>
+    </w:p>
+    <w:p>
+      <w:r>
+        <w:br w:type="page"/>
+      </w:r>
+    </w:p>
+    <w:p>
+      <w:pPr>
+        <w:pStyle w:val="Heading1"/>
+        <w:spacing w:before="360" w:after="200"/>
+      </w:pPr>
+      <w:r>
+        <w:rPr>
+          <w:b/>
+          <w:bCs/>
+          <w:color w:val="1F3A5F"/>
+          <w:sz w:val="36"/>
+          <w:szCs w:val="36"/>
+        </w:rPr>
         <w:t xml:space="preserve">Tips, Shortcuts, and Troubleshooting</w:t>
       </w:r>
     </w:p>
@@ -4417,6 +4845,109 @@
       </w:pPr>
       <w:r>
         <w:t xml:space="preserve">This guide is updated with each major release of the tool.</w:t>
+      </w:r>
+    </w:p>
+    <w:p>
+      <w:pPr>
+        <w:pStyle w:val="Heading2"/>
+        <w:spacing w:before="280" w:after="140"/>
+      </w:pPr>
+      <w:r>
+        <w:rPr>
+          <w:b/>
+          <w:bCs/>
+          <w:color w:val="1F3A5F"/>
+          <w:sz w:val="28"/>
+          <w:szCs w:val="28"/>
+        </w:rPr>
+        <w:t xml:space="preserve">Version 1.7 — May 2026</w:t>
+      </w:r>
+    </w:p>
+    <w:p>
+      <w:pPr>
+        <w:spacing w:after="120" w:line="300"/>
+      </w:pPr>
+      <w:r>
+        <w:t xml:space="preserve">Pricing data foundation. The tool can now load an external price book to enable quoting (cost rendering arrives in a later release).</w:t>
+      </w:r>
+    </w:p>
+    <w:p>
+      <w:pPr>
+        <w:pStyle w:val="ListParagraph"/>
+        <w:numPr>
+          <w:ilvl w:val="0"/>
+          <w:numId w:val="2"/>
+        </w:numPr>
+        <w:spacing w:after="80" w:line="300"/>
+      </w:pPr>
+      <w:r>
+        <w:t xml:space="preserve">Load an external pricing file via </w:t>
+      </w:r>
+      <w:r>
+        <w:rPr>
+          <w:b/>
+          <w:bCs/>
+        </w:rPr>
+        <w:t xml:space="preserve">File → Load Pricing</w:t>
+      </w:r>
+    </w:p>
+    <w:p>
+      <w:pPr>
+        <w:pStyle w:val="ListParagraph"/>
+        <w:numPr>
+          <w:ilvl w:val="0"/>
+          <w:numId w:val="2"/>
+        </w:numPr>
+        <w:spacing w:after="80" w:line="300"/>
+      </w:pPr>
+      <w:r>
+        <w:t xml:space="preserve">Pricing status indicator (top right) and a BOM-drawer reminder banner show whether pricing is loaded</w:t>
+      </w:r>
+    </w:p>
+    <w:p>
+      <w:pPr>
+        <w:pStyle w:val="ListParagraph"/>
+        <w:numPr>
+          <w:ilvl w:val="0"/>
+          <w:numId w:val="2"/>
+        </w:numPr>
+        <w:spacing w:after="80" w:line="300"/>
+      </w:pPr>
+      <w:r>
+        <w:t xml:space="preserve">Clear loaded pricing via </w:t>
+      </w:r>
+      <w:r>
+        <w:rPr>
+          <w:b/>
+          <w:bCs/>
+        </w:rPr>
+        <w:t xml:space="preserve">File → Clear Pricing</w:t>
+      </w:r>
+    </w:p>
+    <w:p>
+      <w:pPr>
+        <w:pStyle w:val="ListParagraph"/>
+        <w:numPr>
+          <w:ilvl w:val="0"/>
+          <w:numId w:val="2"/>
+        </w:numPr>
+        <w:spacing w:after="80" w:line="300"/>
+      </w:pPr>
+      <w:r>
+        <w:t xml:space="preserve">Pricing is stored per-machine in the browser, separate from project files</w:t>
+      </w:r>
+    </w:p>
+    <w:p>
+      <w:pPr>
+        <w:pStyle w:val="ListParagraph"/>
+        <w:numPr>
+          <w:ilvl w:val="0"/>
+          <w:numId w:val="2"/>
+        </w:numPr>
+        <w:spacing w:after="80" w:line="300"/>
+      </w:pPr>
+      <w:r>
+        <w:t xml:space="preserve">Quote totals on the BOM and Take-Off pages will use this pricing data in a future release</w:t>
       </w:r>
     </w:p>
     <w:p>

</xml_diff>